<commit_message>
Add infrastructure and CRM webhook Lambda
</commit_message>
<xml_diff>
--- a/Documentation/InsightFlow_Solution_Design.docx
+++ b/Documentation/InsightFlow_Solution_Design.docx
@@ -647,6 +647,21 @@
       </w:r>
       <w:r>
         <w:t xml:space="preserve">SME confirmed the Wistia API token must be stored in Secrets Manager and never hardcoded or pushed to GitHub (Section 13). Close/Calendly webhook signing secrets are stored the same way.</w:t>
+      </w:r>
+    </w:p>
+    <w:p>
+      <w:pPr>
+        <w:spacing w:after="120"/>
+      </w:pPr>
+      <w:r>
+        <w:rPr>
+          <w:b/>
+          <w:bCs/>
+        </w:rPr>
+        <w:t xml:space="preserve">Provisioning — CloudFormation (infrastructure/foundation.yaml): </w:t>
+      </w:r>
+      <w:r>
+        <w:t xml:space="preserve">The S3 bucket, SQS delay queue + DLQ, placeholder Secrets Manager secrets, and all 7 least-privilege IAM roles are defined as a single CloudFormation template rather than created by hand in the console. This gives every permission change a diffable, reviewable history in git instead of an unrecorded console click — directly addressing the recurring pattern noted across prior capstones of IAM gaps being patched reactively as they're discovered. The template is deployed once, manually (console upload), rather than through GitHub Actions: OIDC federation requires an IAM trust relationship to already exist before GitHub can assume any role, so the very first deploy of foundational infrastructure is necessarily a manual bootstrap step in any AWS account, not a shortcut specific to this project. The OIDC identity provider and deploy role are deferred to when the Lambda/Glue CI/CD pipeline is built (Section 15), since that is the piece the SME confirmed is the actual minimum CI/CD bar — not the one-time foundation stack. Deployed and verified August 10, 2026 (stack: insightflow-foundation).</w:t>
       </w:r>
     </w:p>
     <w:p>
@@ -3051,7 +3066,20 @@
         <w:spacing w:after="80"/>
       </w:pPr>
       <w:r>
-        <w:t xml:space="preserve">Provision S3 bucket, IAM roles, Secrets Manager secrets, the SQS delay queue + DLQ, and the two API Gateway endpoints.</w:t>
+        <w:t xml:space="preserve">Provision the two API Gateway endpoints (CRM, Calendly) and the CRM webhook + consumer Lambda functions.</w:t>
+      </w:r>
+    </w:p>
+    <w:p>
+      <w:pPr>
+        <w:pStyle w:val="ListParagraph"/>
+        <w:numPr>
+          <w:ilvl w:val="0"/>
+          <w:numId w:val="1"/>
+        </w:numPr>
+        <w:spacing w:after="80"/>
+      </w:pPr>
+      <w:r>
+        <w:t xml:space="preserve">Foundation infrastructure deployed (S3 bucket, IAM roles, SQS delay queue + DLQ, placeholder secrets) via infrastructure/foundation.yaml — verified against the stack's Outputs and each console on August 10, 2026.</w:t>
       </w:r>
     </w:p>
     <w:p>

</xml_diff>

<commit_message>
Fix lead-owner and Calendly spend URLs, revert Wistia to Basic Auth, add media metadata pull
</commit_message>
<xml_diff>
--- a/Documentation/InsightFlow_Solution_Design.docx
+++ b/Documentation/InsightFlow_Solution_Design.docx
@@ -779,7 +779,7 @@
         <w:spacing w:after="80"/>
       </w:pPr>
       <w:r>
-        <w:t xml:space="preserve">That Lambda reads the corresponding {lead_id}.json from the public dea-lead-owner S3 bucket. SME confirmed this bucket holds Day-1 (one-day-back) data, and that once the webhook is created, lookups against it are keyed by lead_id (Section 13). Because the bucket refreshes on a daily cycle rather than in step with the 10-minute wait, a lead created today may not yet have an owner reflected in the file the pipeline reads; per SME guidance this is the intended lookup pattern, so the merge step treats a missing owner as a valid outcome (lead_owner: null) rather than an error — no additional polling or extended-wait logic is introduced beyond what the brief specifies.</w:t>
+        <w:t xml:space="preserve">That Lambda reads the corresponding {lead_id}.json from the public dea-lead-owner S3 bucket, at the exact URL pattern given in the requirements doc: https://dea-lead-owner.s3.us-east-1.amazonaws.com/{lead_id}.json (an earlier build of this Lambda defaulted to a URL missing the region in the hostname — caught and fixed in a direct review against the requirements doc). SME confirmed this bucket holds Day-1 (one-day-back) data, and that once the webhook is created, lookups against it are keyed by lead_id (Section 13). Because the bucket refreshes on a daily cycle rather than in step with the 10-minute wait, a lead created today may not yet have an owner reflected in the file the pipeline reads; per SME guidance this is the intended lookup pattern, so the merge step treats a missing owner as a valid outcome (lead_owner: null) rather than an error — no additional polling or extended-wait logic is introduced beyond what the brief specifies.</w:t>
       </w:r>
     </w:p>
     <w:p>
@@ -879,7 +879,7 @@
         <w:spacing w:after="80"/>
       </w:pPr>
       <w:r>
-        <w:t xml:space="preserve">Separate EventBridge-scheduled Lambda pulls the daily spend file (spend_data_{Day-1}.json) each morning after the ~06:00 EST publish window, using file_index.json to confirm availability before pulling; retries on a short backoff if the file isn't yet present. This scheduled pull is unrelated to the CRM delay-mechanism question and is unaffected by SME guidance against using EventBridge Scheduler for the CRM flow specifically.</w:t>
+        <w:t xml:space="preserve">Separate EventBridge-scheduled Lambda pulls the daily spend file (spend_data_{Day-1}.json) each morning after the ~06:00 EST publish window, from https://dea-data-bucket.s3.us-east-1.amazonaws.com/calendly_spend_data/ (confirmed against the requirements doc's literal example — an earlier build guessed a dedicated, nonexistent “dea-calendly-spend” bucket, caught and fixed in the same review), using file_index.json in the same prefix to confirm availability before pulling; retries on a short backoff (the EventBridge schedule's own recurrence, not an in-Lambda sleep loop) if the file isn't yet present. This scheduled pull is unrelated to the CRM delay-mechanism question and is unaffected by SME guidance against using EventBridge Scheduler for the CRM flow specifically.</w:t>
       </w:r>
     </w:p>
     <w:p>
@@ -914,7 +914,7 @@
         <w:spacing w:after="80"/>
       </w:pPr>
       <w:r>
-        <w:t xml:space="preserve">EventBridge-scheduled Lambda authenticates via Bearer token (Authorization header), token in Secrets Manager. Corrected from an earlier “Basic Auth” assumption in this doc after checking Wistia's current API docs directly — Bearer is their officially supported method; HTTP Basic is only listed as a fallback.</w:t>
+        <w:t xml:space="preserve">EventBridge-scheduled Lambda authenticates via HTTP Basic Auth (username “api”, API token as password), token in Secrets Manager, per the requirements doc's explicit instruction. An earlier draft of this doc had briefly changed this to Bearer token auth based on Wistia's general public API docs recommending it as their newer preferred method — reverted after a direct review against the requirements doc showed Basic Auth stated explicitly; the literal brief takes precedence over a general best-practice preference.</w:t>
       </w:r>
     </w:p>
     <w:p>
@@ -927,7 +927,7 @@
         <w:spacing w:after="80"/>
       </w:pPr>
       <w:r>
-        <w:t xml:space="preserve">Pulls media metadata, engagement metrics, and visitor-level data for the two given media IDs, paginating through all result pages.</w:t>
+        <w:t xml:space="preserve">Pulls media metadata, engagement metrics, and visitor-level data for the two given media IDs, paginating through all result pages. A direct review against the requirements doc (August 2026) found the first version of this Lambda was missing the media metadata pull entirely — implemented only engagement and events. Fixed; all three extractions are now implemented as separate calls per media ID.</w:t>
       </w:r>
     </w:p>
     <w:p>

</xml_diff>

<commit_message>
Add flag for signature
</commit_message>
<xml_diff>
--- a/Documentation/InsightFlow_Solution_Design.docx
+++ b/Documentation/InsightFlow_Solution_Design.docx
@@ -3058,6 +3058,19 @@
       </w:pPr>
       <w:r>
         <w:t xml:space="preserve">6. Notification target: the brief says to notify “the team” via Slack or email, and separately, access was granted to a DEA Slack workspace — raising the question of whether notifications are expected in that shared workspace rather than a personal one. Assuming a personal Slack incoming webhook is acceptable for now, since the DEA workspace likely requires admin permissions to install an app that this project doesn't have. The webhook URL lives in Secrets Manager, so switching to a DEA-workspace webhook later is a one-value change, not a code change.</w:t>
+      </w:r>
+    </w:p>
+    <w:p>
+      <w:pPr>
+        <w:pStyle w:val="ListParagraph"/>
+        <w:numPr>
+          <w:ilvl w:val="0"/>
+          <w:numId w:val="1"/>
+        </w:numPr>
+        <w:spacing w:after="80"/>
+      </w:pPr>
+      <w:r>
+        <w:t xml:space="preserve">7. Webhook signature validation temporarily disabled (CRM and Calendly endpoints): the requirements doc never mandates signature validation — it was added independently as standard webhook security practice, not a stated requirement. Both signing secrets remain pending an SME handoff: Close generates its signing_key server-side at subscription creation and returns it only to whoever created the subscription (not reproducible on our end); Calendly's signing_key is an optional field the creator may or may not have set at all. With validation left enabled, real Close/Calendly traffic was failing signature checks (confirmed via CloudWatch logs showing genuine inbound events, not test traffic), and Close auto-pauses a subscription after 3 consecutive days of failed deliveries. REQUIRE_SIGNATURE_VALIDATION (both Lambdas, default “true”, CloudFormation parameter) has been set to “false” as a deliberate, temporary, reversible bridge so real data keeps flowing while the secret handoff is pending — not a permanent weakening of the design. Every invocation while disabled logs a WARNING-level message specifically so this can't silently stay off. Revert to “true” the moment each real secret (or confirmation that Calendly's was never set) is available.</w:t>
       </w:r>
     </w:p>
     <w:p>

</xml_diff>

<commit_message>
Add flag for Slack notifications
</commit_message>
<xml_diff>
--- a/Documentation/InsightFlow_Solution_Design.docx
+++ b/Documentation/InsightFlow_Solution_Design.docx
@@ -836,6 +836,19 @@
     </w:p>
     <w:p>
       <w:pPr>
+        <w:pStyle w:val="ListParagraph"/>
+        <w:numPr>
+          <w:ilvl w:val="0"/>
+          <w:numId w:val="1"/>
+        </w:numPr>
+        <w:spacing w:after="80"/>
+      </w:pPr>
+      <w:r>
+        <w:t xml:space="preserve">Operational note, observed directly: Close retries failed deliveries for up to 72 hours, so a period of signature-validation failures (Section 13) meant a real retry backlog had accumulated. Disabling validation caused that entire backlog to succeed at once, not just new events going forward — a burst of dozens of leads landing within seconds of each other, which then produced a correspondingly large burst of Slack notifications roughly 10 minutes later (the delay queue doesn't smooth out bursts, it just uniformly shifts them). Not a bug; a predictable consequence of clearing a multi-day blocker. NOTIFY_SLACK (default “true”) was added as a volume-control toggle for exactly this situation — lets processing (S3 write, idempotency) continue while suppressing the notification fan-out during a large backlog drain, without touching REQUIRE_SIGNATURE_VALIDATION's security semantics.</w:t>
+      </w:r>
+    </w:p>
+    <w:p>
+      <w:pPr>
         <w:pStyle w:val="Heading1"/>
         <w:spacing w:after="150" w:before="300"/>
       </w:pPr>
@@ -2325,7 +2338,7 @@
         <w:spacing w:after="150" w:before="300"/>
       </w:pPr>
       <w:r>
-        <w:t xml:space="preserve">13. Resolved via SME Response (August 10, 2026)</w:t>
+        <w:t xml:space="preserve">13. Resolved via SME Response</w:t>
       </w:r>
     </w:p>
     <w:p>
@@ -2337,7 +2350,7 @@
           <w:i/>
           <w:iCs/>
         </w:rPr>
-        <w:t xml:space="preserve">Questions were sent to Avirup, Azmat, Ninad, and Kareem; a full response was received August 10, 2026 after 24+ hours and two follow-ups. Decisions below are now settled and reflected throughout this document rather than treated as assumptions.</w:t>
+        <w:t xml:space="preserve">Questions were sent to Avirup, Azmat, Ninad, and Kareem; a full response was received August 10, 2026 after 24+ hours and two follow-ups, with additional confirmations arriving via follow-up as real traffic surfaced new questions. Decisions below are now settled and reflected throughout this document rather than treated as assumptions.</w:t>
       </w:r>
     </w:p>
     <w:tbl>
@@ -2960,6 +2973,56 @@
           </w:p>
         </w:tc>
       </w:tr>
+      <w:tr>
+        <w:tc>
+          <w:tcPr>
+            <w:tcW w:type="dxa" w:w="1800"/>
+          </w:tcPr>
+          <w:p>
+            <w:r>
+              <w:rPr>
+                <w:b w:val="false"/>
+                <w:bCs w:val="false"/>
+                <w:sz w:val="20"/>
+                <w:szCs w:val="20"/>
+              </w:rPr>
+              <w:t xml:space="preserve">CRM webhook signature (Aug 12 follow-up)</w:t>
+            </w:r>
+          </w:p>
+        </w:tc>
+        <w:tc>
+          <w:tcPr>
+            <w:tcW w:type="dxa" w:w="3300"/>
+          </w:tcPr>
+          <w:p>
+            <w:r>
+              <w:rPr>
+                <w:b w:val="false"/>
+                <w:bCs w:val="false"/>
+                <w:sz w:val="20"/>
+                <w:szCs w:val="20"/>
+              </w:rPr>
+              <w:t xml:space="preserve">“It would be only json data and no signatures on your part. We have created on our own the webhook for your API gateway endpoint url. So no signature or secrets needed.” — confirmed after real Close traffic was observed failing signature validation in CloudWatch logs</w:t>
+            </w:r>
+          </w:p>
+        </w:tc>
+        <w:tc>
+          <w:tcPr>
+            <w:tcW w:type="dxa" w:w="2500"/>
+          </w:tcPr>
+          <w:p>
+            <w:r>
+              <w:rPr>
+                <w:b w:val="false"/>
+                <w:bCs w:val="false"/>
+                <w:sz w:val="20"/>
+                <w:szCs w:val="20"/>
+              </w:rPr>
+              <w:t xml:space="preserve">REQUIRE_SIGNATURE_VALIDATION set to “false” permanently for the CRM endpoint, not as a temporary bridge. The toggle mechanism itself is retained (harmless, and useful if this ever changes) but the open item is closed — see Section 6</w:t>
+            </w:r>
+          </w:p>
+        </w:tc>
+      </w:tr>
     </w:tbl>
     <w:p>
       <w:pPr>
@@ -3070,7 +3133,7 @@
         <w:spacing w:after="80"/>
       </w:pPr>
       <w:r>
-        <w:t xml:space="preserve">7. Webhook signature validation temporarily disabled (CRM and Calendly endpoints): the requirements doc never mandates signature validation — it was added independently as standard webhook security practice, not a stated requirement. Both signing secrets remain pending an SME handoff: Close generates its signing_key server-side at subscription creation and returns it only to whoever created the subscription (not reproducible on our end); Calendly's signing_key is an optional field the creator may or may not have set at all. With validation left enabled, real Close/Calendly traffic was failing signature checks (confirmed via CloudWatch logs showing genuine inbound events, not test traffic), and Close auto-pauses a subscription after 3 consecutive days of failed deliveries. REQUIRE_SIGNATURE_VALIDATION (both Lambdas, default “true”, CloudFormation parameter) has been set to “false” as a deliberate, temporary, reversible bridge so real data keeps flowing while the secret handoff is pending — not a permanent weakening of the design. Every invocation while disabled logs a WARNING-level message specifically so this can't silently stay off. Revert to “true” the moment each real secret (or confirmation that Calendly's was never set) is available.</w:t>
+        <w:t xml:space="preserve">7. Calendly webhook signature (project decision, not SME confirmation): SME confirmed (Aug 12 follow-up) that the CRM/Close endpoint uses no signature at all, by design — resolved, see Section 13. The same wasn't separately confirmed for Calendly, but is now treated as resolved by project decision rather than left open: given the SME response pattern on this project and that Calendly's signing_key is genuinely optional at subscription creation (so “none was ever set” is plausible here too, not just “not yet sent”), REQUIRE_SIGNATURE_VALIDATION now defaults to “false” for Calendly as well. This is explicitly the project owner's judgment call, documented as such rather than attributed to the SME — reversible via the same flag if evidence emerges otherwise.</w:t>
       </w:r>
     </w:p>
     <w:p>

</xml_diff>

<commit_message>
Add documentation for project submission
</commit_message>
<xml_diff>
--- a/Documentation/InsightFlow_Solution_Design.docx
+++ b/Documentation/InsightFlow_Solution_Design.docx
@@ -79,7 +79,7 @@
         <w:t xml:space="preserve">Approval gate: </w:t>
       </w:r>
       <w:r>
-        <w:t xml:space="preserve">the project brief requires the architecture and data model to be presented for SME approval before implementation proceeds. This document, together with the accompanying workflow diagram, is that submission. The initial draft proceeded on documented working assumptions where SME answers were not yet available; SME responses received on August 10, 2026 are incorporated throughout and summarized in Section 13. A short list of items remains genuinely open and is tracked in Section 14.</w:t>
+        <w:t xml:space="preserve">the project brief requires the architecture and data model to be presented for SME approval before implementation proceeds. This document, together with the accompanying workflow diagram, is that submission. The initial draft proceeded on documented working assumptions where SME answers were not yet available; SME responses received on August 10, 2026 are incorporated throughout and summarized in Section 17. A short list of items remains genuinely open and is tracked in Section 18.</w:t>
       </w:r>
     </w:p>
     <w:p>
@@ -454,7 +454,7 @@
         <w:spacing w:after="120"/>
       </w:pPr>
       <w:r>
-        <w:t xml:space="preserve">Note: Calendly is a hybrid source — booking events arrive real-time via webhook, but the cost data needed to compute Cost-Per-Booking only exists as a once-daily batch file. SME response confirmed this reading directly: Calendly webhook ingestion is real-time, event-driven, while downstream transformation involving the daily spend data can be batch (Section 13).</w:t>
+        <w:t xml:space="preserve">Note: Calendly is a hybrid source — booking events arrive real-time via webhook, but the cost data needed to compute Cost-Per-Booking only exists as a once-daily batch file. SME response confirmed this reading directly: Calendly webhook ingestion is real-time, event-driven, while downstream transformation involving the daily spend data can be batch (Section 17).</w:t>
       </w:r>
     </w:p>
     <w:p>
@@ -471,7 +471,7 @@
         <w:spacing w:after="120"/>
       </w:pPr>
       <w:r>
-        <w:t xml:space="preserve">Serverless, event-driven medallion architecture on S3. SME confirmed either AWS or Azure is acceptable for this project; AWS is retained throughout this document, consistent with the existing stack and prior capstones (Section 13). No persistent database or always-on compute; storage and compute are decoupled the same way as the Global Partners and Healthcare Metrics capstones.</w:t>
+        <w:t xml:space="preserve">Serverless, event-driven medallion architecture on S3. SME confirmed either AWS or Azure is acceptable for this project; AWS is retained throughout this document, consistent with the existing stack and prior capstones (Section 17). No persistent database or always-on compute; storage and compute are decoupled the same way as the Global Partners and Healthcare Metrics capstones.</w:t>
       </w:r>
     </w:p>
     <w:p>
@@ -479,7 +479,7 @@
         <w:spacing w:after="120"/>
       </w:pPr>
       <w:r>
-        <w:t xml:space="preserve">Ingestion is split by pattern: webhook sources (Close, Calendly bookings) land through API Gateway + Lambda into S3 raw/ the moment an event arrives. Scheduled sources (Wistia, Calendly spend file) are pulled by EventBridge-triggered Lambdas on a cron schedule — this scheduled pattern is unaffected by SME guidance on the CRM flow (see below) since it was never part of the delay-mechanism question. The CRM per-lead flow uses an SQS delay queue rather than an orchestrator: SME direction was explicit that the SQS delay-queue pattern named in the brief should be used, and that Step Functions or EventBridge Scheduler are unnecessary for this flow absent a specific reason (Section 13).</w:t>
+        <w:t xml:space="preserve">Ingestion is split by pattern: webhook sources (Close, Calendly bookings) land through API Gateway + Lambda into S3 raw/ the moment an event arrives. Scheduled sources (Wistia, Calendly spend file) are pulled by EventBridge-triggered Lambdas on a cron schedule — this scheduled pattern is unaffected by SME guidance on the CRM flow (see below) since it was never part of the delay-mechanism question. The CRM per-lead flow uses an SQS delay queue rather than an orchestrator: SME direction was explicit that the SQS delay-queue pattern named in the brief should be used, and that Step Functions or EventBridge Scheduler are unnecessary for this flow absent a specific reason (Section 17).</w:t>
       </w:r>
     </w:p>
     <w:p>
@@ -487,7 +487,7 @@
         <w:spacing w:after="120"/>
       </w:pPr>
       <w:r>
-        <w:t xml:space="preserve">Glue Python Shell (or Glue ETL/PySpark if volume across all three sources exceeds the single-node comfort range — to be confirmed once real data volumes are known) transforms raw JSON into cleaned, typed Parquet in processed/. Athena CTAS aggregates processed/ into metric-ready tables in marts/. QuickSight reads marts/ via Athena to render the cross-source dashboards — SME confirmed QuickSight is acceptable and Streamlit hosting is not mandatory (Section 13).</w:t>
+        <w:t xml:space="preserve">Glue Python Shell (or Glue ETL/PySpark if volume across all three sources exceeds the single-node comfort range — to be confirmed once real data volumes are known) transforms raw JSON into cleaned, typed Parquet in processed/. Athena CTAS aggregates processed/ into metric-ready tables in marts/. QuickSight reads marts/ via Athena to render the cross-source dashboards — SME confirmed QuickSight is acceptable and Streamlit hosting is not mandatory (Section 17).</w:t>
       </w:r>
     </w:p>
     <w:p>
@@ -511,7 +511,7 @@
         <w:t xml:space="preserve">Ingestion — API Gateway + Lambda (CRM, Calendly webhooks): </w:t>
       </w:r>
       <w:r>
-        <w:t xml:space="preserve">Both Close and Calendly deliver events via outbound webhook POST. API Gateway provides the public HTTPS endpoint; Lambda validates the signature (Close-Sig-Hash / Calendly signing secret) and writes the raw event to S3. This is the only practical pattern for receiving third-party webhooks on AWS without standing up always-on compute. SME confirmed Avirup will assist directly with webhook creation on the Close/Calendly side once the endpoint URLs are ready (Section 13).</w:t>
+        <w:t xml:space="preserve">Both Close and Calendly deliver events via outbound webhook POST. API Gateway provides the public HTTPS endpoint; Lambda validates the signature (Close-Sig-Hash / Calendly signing secret) and writes the raw event to S3. This is the only practical pattern for receiving third-party webhooks on AWS without standing up always-on compute. SME confirmed Avirup will assist directly with webhook creation on the Close/Calendly side once the endpoint URLs are ready (Section 17).</w:t>
       </w:r>
     </w:p>
     <w:p>
@@ -526,7 +526,7 @@
         <w:t xml:space="preserve">Delay mechanism — SQS delay queue (CRM lead flow): </w:t>
       </w:r>
       <w:r>
-        <w:t xml:space="preserve">The CRM flow needs a 10-minute pause between landing the webhook event and looking up the lead owner, because owner assignment happens asynchronously in Close after lead creation — SME confirmed this reading directly (Section 13). Per SME direction, this is implemented as the SQS delay-queue pattern named in the brief, not Step Functions or EventBridge Scheduler: the webhook Lambda sends a message (lead_id + event metadata) to a standard SQS queue with DelaySeconds=600; a second Lambda, wired to the queue via an event-source mapping, only receives the message once the 10-minute delay has elapsed, and performs the lookup, merge, and notify steps in sequence within that single invocation. Because SQS standard queues are at-least-once delivery, idempotency is handled in code rather than by the platform: the consumer Lambda checks for an existing processed/crm_leads_enriched/ record for that lead_id before writing, so a redelivered message is a no-op rather than a duplicate. The queue's redrive policy routes messages to a dedicated dead-letter queue after 3 failed processing attempts, with a CloudWatch alarm on DLQ depth — this is the mechanism used to demonstrate the brief's fault-tolerance/recovery requirement, in place of Step Functions' execution history. A fuller Step Functions-based design was proposed and considered (Section 12) but not implemented, per direct SME guidance that it isn't needed here absent a specific reason.</w:t>
+        <w:t xml:space="preserve">The CRM flow needs a 10-minute pause between landing the webhook event and looking up the lead owner, because owner assignment happens asynchronously in Close after lead creation — SME confirmed this reading directly (Section 17). Per SME direction, this is implemented as the SQS delay-queue pattern named in the brief, not Step Functions or EventBridge Scheduler: the webhook Lambda sends a message (lead_id + event metadata) to a standard SQS queue with DelaySeconds=600; a second Lambda, wired to the queue via an event-source mapping, only receives the message once the 10-minute delay has elapsed, and performs the lookup, merge, and notify steps in sequence within that single invocation. Because SQS standard queues are at-least-once delivery, idempotency is handled in code rather than by the platform: the consumer Lambda checks for an existing processed/crm_leads_enriched/ record for that lead_id before writing, so a redelivered message is a no-op rather than a duplicate. The queue's redrive policy routes messages to a dedicated dead-letter queue after 3 failed processing attempts, with a CloudWatch alarm on DLQ depth — this is the mechanism used to demonstrate the brief's fault-tolerance/recovery requirement, in place of Step Functions' execution history. A fuller Step Functions-based design was proposed and considered (Section 16) but not implemented, per direct SME guidance that it isn't needed here absent a specific reason.</w:t>
       </w:r>
     </w:p>
     <w:p>
@@ -616,7 +616,7 @@
         <w:t xml:space="preserve">Dashboard — Amazon QuickSight: </w:t>
       </w:r>
       <w:r>
-        <w:t xml:space="preserve">SME confirmed QuickSight is acceptable in place of Streamlit and that Streamlit's public-hosting requirement is not mandatory (Section 13), matching precedent from the last two capstones.</w:t>
+        <w:t xml:space="preserve">SME confirmed QuickSight is acceptable in place of Streamlit and that Streamlit's public-hosting requirement is not mandatory (Section 17), matching precedent from the last two capstones.</w:t>
       </w:r>
     </w:p>
     <w:p>
@@ -631,7 +631,7 @@
         <w:t xml:space="preserve">Notifications — Slack incoming webhook: </w:t>
       </w:r>
       <w:r>
-        <w:t xml:space="preserve">SME confirmed either Slack or email is acceptable (Section 13). Slack is used because a workspace incoming-webhook URL is a five-minute setup, versus SES's domain-verification or sandbox-address overhead. Built behind a single notification-adapter function so switching to SES later is a one-function change, not a redesign.</w:t>
+        <w:t xml:space="preserve">SME confirmed either Slack or email is acceptable (Section 17). Slack is used because a workspace incoming-webhook URL is a five-minute setup, versus SES's domain-verification or sandbox-address overhead. Built behind a single notification-adapter function so switching to SES later is a one-function change, not a redesign.</w:t>
       </w:r>
     </w:p>
     <w:p>
@@ -646,7 +646,7 @@
         <w:t xml:space="preserve">Security — Secrets Manager: </w:t>
       </w:r>
       <w:r>
-        <w:t xml:space="preserve">SME confirmed the Wistia API token must be stored in Secrets Manager and never hardcoded or pushed to GitHub (Section 13). Close/Calendly webhook signing secrets are stored the same way.</w:t>
+        <w:t xml:space="preserve">SME confirmed the Wistia API token must be stored in Secrets Manager and never hardcoded or pushed to GitHub (Section 17). Close/Calendly webhook signing secrets are stored the same way.</w:t>
       </w:r>
     </w:p>
     <w:p>
@@ -661,7 +661,7 @@
         <w:t xml:space="preserve">Provisioning — CloudFormation (infrastructure/foundation.yaml): </w:t>
       </w:r>
       <w:r>
-        <w:t xml:space="preserve">The S3 bucket, SQS delay queue + DLQ, placeholder Secrets Manager secrets, and all 7 least-privilege IAM roles are defined as a single CloudFormation template rather than created by hand in the console. This gives every permission change a diffable, reviewable history in git instead of an unrecorded console click — directly addressing the recurring pattern noted across prior capstones of IAM gaps being patched reactively as they're discovered. The template is deployed once, manually (console upload), rather than through GitHub Actions: OIDC federation requires an IAM trust relationship to already exist before GitHub can assume any role, so the very first deploy of foundational infrastructure is necessarily a manual bootstrap step in any AWS account, not a shortcut specific to this project. The OIDC identity provider and deploy role are deferred to when the Lambda/Glue CI/CD pipeline is built (Section 15), since that is the piece the SME confirmed is the actual minimum CI/CD bar — not the one-time foundation stack. Deployed and verified August 10, 2026 (stack: insightflow-foundation).</w:t>
+        <w:t xml:space="preserve">The S3 bucket, SQS delay queue + DLQ, placeholder Secrets Manager secrets, and all 7 least-privilege IAM roles are defined as a single CloudFormation template rather than created by hand in the console. This gives every permission change a diffable, reviewable history in git instead of an unrecorded console click — directly addressing the recurring pattern noted across prior capstones of IAM gaps being patched reactively as they're discovered. The template is deployed once, manually (console upload), rather than through GitHub Actions: OIDC federation requires an IAM trust relationship to already exist before GitHub can assume any role, so the very first deploy of foundational infrastructure is necessarily a manual bootstrap step in any AWS account, not a shortcut specific to this project. The OIDC identity provider and deploy role are deferred to when the Lambda/Glue CI/CD pipeline is built (Section 19), since that is the piece the SME confirmed is the actual minimum CI/CD bar — not the one-time foundation stack. Deployed and verified August 10, 2026 (stack: insightflow-foundation).</w:t>
       </w:r>
     </w:p>
     <w:p>
@@ -727,7 +727,7 @@
         <w:spacing w:after="120"/>
       </w:pPr>
       <w:r>
-        <w:t xml:space="preserve">Per SME direction, this flow uses the SQS delay-queue pattern named in the brief rather than an orchestrator — Step Functions and EventBridge Scheduler are not used here (Section 13).</w:t>
+        <w:t xml:space="preserve">Per SME direction, this flow uses the SQS delay-queue pattern named in the brief rather than an orchestrator — Step Functions and EventBridge Scheduler are not used here (Section 17).</w:t>
       </w:r>
     </w:p>
     <w:p>
@@ -779,7 +779,7 @@
         <w:spacing w:after="80"/>
       </w:pPr>
       <w:r>
-        <w:t xml:space="preserve">That Lambda reads the corresponding {lead_id}.json from the public dea-lead-owner S3 bucket, at the exact URL pattern given in the requirements doc: https://dea-lead-owner.s3.us-east-1.amazonaws.com/{lead_id}.json (an earlier build of this Lambda defaulted to a URL missing the region in the hostname — caught and fixed in a direct review against the requirements doc). SME confirmed this bucket holds Day-1 (one-day-back) data, and that once the webhook is created, lookups against it are keyed by lead_id (Section 13). Because the bucket refreshes on a daily cycle rather than in step with the 10-minute wait, a lead created today may not yet have an owner reflected in the file the pipeline reads; per SME guidance this is the intended lookup pattern, so the merge step treats a missing owner as a valid outcome (lead_owner: null) rather than an error — no additional polling or extended-wait logic is introduced beyond what the brief specifies.</w:t>
+        <w:t xml:space="preserve">That Lambda reads the corresponding {lead_id}.json from the public dea-lead-owner S3 bucket, at the exact URL pattern given in the requirements doc: https://dea-lead-owner.s3.us-east-1.amazonaws.com/{lead_id}.json (an earlier build of this Lambda defaulted to a URL missing the region in the hostname — caught and fixed in a direct review against the requirements doc). SME confirmed this bucket holds Day-1 (one-day-back) data, and that once the webhook is created, lookups against it are keyed by lead_id (Section 17). Because the bucket refreshes on a daily cycle rather than in step with the 10-minute wait, a lead created today may not yet have an owner reflected in the file the pipeline reads; per SME guidance this is the intended lookup pattern, so the merge step treats a missing owner as a valid outcome (lead_owner: null) rather than an error — no additional polling or extended-wait logic is introduced beyond what the brief specifies.</w:t>
       </w:r>
     </w:p>
     <w:p>
@@ -844,7 +844,7 @@
         <w:spacing w:after="80"/>
       </w:pPr>
       <w:r>
-        <w:t xml:space="preserve">Operational note, observed directly: Close retries failed deliveries for up to 72 hours, so a period of signature-validation failures (Section 13) meant a real retry backlog had accumulated. Disabling validation caused that entire backlog to succeed at once, not just new events going forward — a burst of dozens of leads landing within seconds of each other, which then produced a correspondingly large burst of Slack notifications roughly 10 minutes later (the delay queue doesn't smooth out bursts, it just uniformly shifts them). Not a bug; a predictable consequence of clearing a multi-day blocker. NOTIFY_SLACK (default “true”) was added as a volume-control toggle for exactly this situation — lets processing (S3 write, idempotency) continue while suppressing the notification fan-out during a large backlog drain, without touching REQUIRE_SIGNATURE_VALIDATION's security semantics.</w:t>
+        <w:t xml:space="preserve">Operational note, observed directly: Close retries failed deliveries for up to 72 hours, so a period of signature-validation failures (Section 17) meant a real retry backlog had accumulated. Disabling validation caused that entire backlog to succeed at once, not just new events going forward — a burst of dozens of leads landing within seconds of each other, which then produced a correspondingly large burst of Slack notifications roughly 10 minutes later (the delay queue doesn't smooth out bursts, it just uniformly shifts them). Not a bug; a predictable consequence of clearing a multi-day blocker. NOTIFY_SLACK (default “true”) was added as a volume-control toggle for exactly this situation — lets processing (S3 write, idempotency) continue while suppressing the notification fan-out during a large backlog drain, without touching REQUIRE_SIGNATURE_VALIDATION's security semantics.</w:t>
       </w:r>
     </w:p>
     <w:p>
@@ -1371,7 +1371,7 @@
         <w:spacing w:after="120"/>
       </w:pPr>
       <w:r>
-        <w:t xml:space="preserve">channel_performance_summary is therefore built at channel + date grain, not person grain: for a given channel and day, it rolls up Wistia plays/engagement, Calendly bookings, and CRM leads created side by side. This answers the brief's request to “find relevance between marketing efforts, video visitor analysis, and new lead generation” as a correlation between channel-level trends, not as a traced individual customer journey. This mart was originally scoped as marketing_engagement_lead_correlation implying a joined journey; renamed here to avoid overstating what the join can support (Section 14, Item 3).</w:t>
+        <w:t xml:space="preserve">channel_performance_summary is therefore built at channel + date grain, not person grain: for a given channel and day, it rolls up Wistia plays/engagement, Calendly bookings, and CRM leads created side by side. This answers the brief's request to “find relevance between marketing efforts, video visitor analysis, and new lead generation” as a correlation between channel-level trends, not as a traced individual customer journey. This mart was originally scoped as marketing_engagement_lead_correlation implying a joined journey; renamed here to avoid overstating what the join can support (Section 18, Item 3).</w:t>
       </w:r>
     </w:p>
     <w:p>
@@ -1380,7 +1380,249 @@
         <w:spacing w:after="150" w:before="300"/>
       </w:pPr>
       <w:r>
-        <w:t xml:space="preserve">11. Cost Considerations</w:t>
+        <w:t xml:space="preserve">11. Glue Transform Layer — Detailed Flow</w:t>
+      </w:r>
+    </w:p>
+    <w:p>
+      <w:pPr>
+        <w:spacing w:after="120"/>
+      </w:pPr>
+      <w:r>
+        <w:t xml:space="preserve">Two Glue Python Shell jobs (PythonVersion 3.9, which ships with pandas and awswrangler pre-installed — no custom Lambda-style layer needed) read raw/ and write clean Parquet to processed/, on a full-rebuild pattern: every run reads everything currently under the relevant raw/ prefix and completely overwrites the corresponding processed/ table, matching the Healthcare Metrics precedent. Neither job touches marts/ — that's Athena CTAS territory (Section 13).</w:t>
+      </w:r>
+    </w:p>
+    <w:p>
+      <w:pPr>
+        <w:spacing w:after="120"/>
+      </w:pPr>
+      <w:r>
+        <w:rPr>
+          <w:b/>
+          <w:bCs/>
+        </w:rPr>
+        <w:t xml:space="preserve">Calendly transform (glue_jobs/calendly_transform/script.py): </w:t>
+      </w:r>
+      <w:r>
+        <w:t xml:space="preserve">Flattens raw booking events and spend files into two separate clean tables, processed/calendly_bookings/ and processed/calendly_spend/ — not joined here, per Section 7's original design. channel is re-derived independently from the raw payload (not trusted from the webhook Lambda's own determination) using the same tracking.utm_campaign / utm_source / Q&amp;A-fallback logic. A real production bug surfaced here: with every real booking captured for a period showing channel=None, pyarrow had no actual string data to infer a column type from and defaulted to INTEGER instead of VARCHAR, breaking every downstream query that compared or coalesced the column. Fixed by explicitly casting channel and campaign_raw to pandas' nullable “string” dtype rather than leaving type inference to chance — a real, confirmed finding, not a hypothetical, and worth remembering for any other column that could plausibly be all-null for a stretch of real traffic.</w:t>
+      </w:r>
+    </w:p>
+    <w:p>
+      <w:pPr>
+        <w:spacing w:after="120"/>
+      </w:pPr>
+      <w:r>
+        <w:rPr>
+          <w:b/>
+          <w:bCs/>
+        </w:rPr>
+        <w:t xml:space="preserve">Wistia transform (glue_jobs/wistia_transform/script.py): </w:t>
+      </w:r>
+      <w:r>
+        <w:t xml:space="preserve">Splits into THREE tables — processed/wistia_media_metadata/, processed/wistia_engagement/, processed/wistia_events/ — deliberately different from the single wistia_engagement/ table sketched in Section 5's original folder layout. Metadata (one row per media), engagement (one row per pull, an aggregate snapshot), and events (one row per visitor action) are three genuinely different grains; forcing them into one table means either sparse columns or losing the events table's natural row structure. Same reasoning that justified splitting Calendly into two tables. A second real production bug surfaced here: Wistia's real event payloads include a conversion_data field that comes back as an empty dict ({}) on events with no conversion tracked — pyarrow cannot write an empty struct to Parquet at all (ArrowNotImplementedError, not a graceful skip, unlike the Calendly case). Fixed generically: any column holding dict or list values is JSON-stringified before writing, rather than special-casing this one field, since Wistia's full event schema isn't documented anywhere available to this project.</w:t>
+      </w:r>
+    </w:p>
+    <w:p>
+      <w:pPr>
+        <w:pStyle w:val="Heading1"/>
+        <w:spacing w:after="150" w:before="300"/>
+      </w:pPr>
+      <w:r>
+        <w:t xml:space="preserve">12. Glue Data Catalog</w:t>
+      </w:r>
+    </w:p>
+    <w:p>
+      <w:pPr>
+        <w:spacing w:after="120"/>
+      </w:pPr>
+      <w:r>
+        <w:t xml:space="preserve">One Glue Crawler (infrastructure/catalog.yaml) registers all processed/ tables into a single Glue database (insightflow) on a daily schedule. Two real misconfigurations were found and fixed before this worked correctly, both worth understanding since they're non-obvious Glue crawler behaviors, not InsightFlow-specific mistakes:</w:t>
+      </w:r>
+    </w:p>
+    <w:p>
+      <w:pPr>
+        <w:pStyle w:val="ListParagraph"/>
+        <w:numPr>
+          <w:ilvl w:val="0"/>
+          <w:numId w:val="1"/>
+        </w:numPr>
+        <w:spacing w:after="80"/>
+      </w:pPr>
+      <w:r>
+        <w:t xml:space="preserve">First attempt (single S3 target at processed/, no grouping configuration): produced 460 tables instead of 6. By default, Glue's crawler does not reliably group files with even slightly varying schemas into one table — it can create a separate table per FILE. processed/crm_leads_enriched/ has one small file per lead (hundreds by then, each independently written with typing that can vary lead to lead); without explicit grouping configuration, each file became its own table.</w:t>
+      </w:r>
+    </w:p>
+    <w:p>
+      <w:pPr>
+        <w:pStyle w:val="ListParagraph"/>
+        <w:numPr>
+          <w:ilvl w:val="0"/>
+          <w:numId w:val="1"/>
+        </w:numPr>
+        <w:spacing w:after="80"/>
+      </w:pPr>
+      <w:r>
+        <w:t xml:space="preserve">Second attempt (added Configuration: {"Grouping": {"TableGroupingPolicy": "CombineCompatibleSchemas"}}, still one S3 target at processed/): overcorrected to 1 table. CombineCompatibleSchemas merged all six genuinely different data types into a single table named “processed,” with the subfolder names becoming a partition value instead of separate tables — a documented AWS/Athena pitfall for exactly this configuration.</w:t>
+      </w:r>
+    </w:p>
+    <w:p>
+      <w:pPr>
+        <w:pStyle w:val="ListParagraph"/>
+        <w:numPr>
+          <w:ilvl w:val="0"/>
+          <w:numId w:val="1"/>
+        </w:numPr>
+        <w:spacing w:after="80"/>
+      </w:pPr>
+      <w:r>
+        <w:t xml:space="preserve">Working fix: explicit, separate S3 targets — one per actual table (processed/crm_leads_enriched/, processed/calendly_bookings/, etc.) — rather than one target at the shared parent prefix. This removes the ambiguity entirely; CombineCompatibleSchemas still does its job WITHIN each target, correctly merging the many per-lead files into one table without merging across folders. Tradeoff: a 7th processed table added later needs a manual addition to this target list — not auto-discovered — accepted deliberately given how both heuristic-only approaches had just failed in opposite directions.</w:t>
+      </w:r>
+    </w:p>
+    <w:p>
+      <w:pPr>
+        <w:pStyle w:val="Heading1"/>
+        <w:spacing w:after="150" w:before="300"/>
+      </w:pPr>
+      <w:r>
+        <w:t xml:space="preserve">13. Athena Marts Build — Implementation Details</w:t>
+      </w:r>
+    </w:p>
+    <w:p>
+      <w:pPr>
+        <w:spacing w:after="120"/>
+      </w:pPr>
+      <w:r>
+        <w:t xml:space="preserve">A single Lambda (lambdas/marts_builder, EventBridge-scheduled daily at 08:00 UTC, a couple hours after the crawler's own 06:00 UTC run) executes the 7 CTAS queries from Section 9/10 against Athena. Full-rebuild pattern, same as everywhere else in this project — but CTAS has a constraint the others don't: Athena's CREATE TABLE AS SELECT fails outright if its target S3 location already has any data in it (confirmed against AWS's own docs; unlike awswrangler's mode="overwrite" used elsewhere, native CTAS has no overwrite option). Each mart's rebuild is therefore a three-step sequence per run: DROP TABLE IF EXISTS (Glue Catalog entry only, doesn't touch S3), delete every object under marts/&lt;name&gt;/ directly via S3, then run the CTAS to recreate fresh.</w:t>
+      </w:r>
+    </w:p>
+    <w:p>
+      <w:pPr>
+        <w:spacing w:after="120"/>
+      </w:pPr>
+      <w:r>
+        <w:t xml:space="preserve">NULL channel handling: every real Calendly booking observed for a long stretch had channel=None (Section 18). Every mart that groups by channel uses COALESCE(channel, 'organic_unknown') so these bookings form a visible, countable bucket instead of silently vanishing from GROUP BY results — genuinely useful given what real traffic looks like, not just a null-safety nicety.</w:t>
+      </w:r>
+    </w:p>
+    <w:p>
+      <w:pPr>
+        <w:spacing w:after="120"/>
+      </w:pPr>
+      <w:r>
+        <w:t xml:space="preserve">Three real, distinct bugs were found and fixed across the first three attempts to run this Lambda — none were SQL logic errors; all were infrastructure/type issues only discoverable against live AWS behavior:</w:t>
+      </w:r>
+    </w:p>
+    <w:p>
+      <w:pPr>
+        <w:pStyle w:val="ListParagraph"/>
+        <w:numPr>
+          <w:ilvl w:val="0"/>
+          <w:numId w:val="1"/>
+        </w:numPr>
+        <w:spacing w:after="80"/>
+      </w:pPr>
+      <w:r>
+        <w:t xml:space="preserve">1. Missing s3:GetBucketLocation on the marts-builder IAM role: every query failed identically with “Unable to verify/create output bucket,” before any SQL was even evaluated. A well-documented, common Athena gap — GetBucketLocation is a distinct, bucket-level permission Athena requires before running any query, not covered by ListBucket or object-level Get/Put.</w:t>
+      </w:r>
+    </w:p>
+    <w:p>
+      <w:pPr>
+        <w:pStyle w:val="ListParagraph"/>
+        <w:numPr>
+          <w:ilvl w:val="0"/>
+          <w:numId w:val="1"/>
+        </w:numPr>
+        <w:spacing w:after="80"/>
+      </w:pPr>
+      <w:r>
+        <w:t xml:space="preserve">2. Athena workgroup had EnforceWorkGroupConfiguration: true, which blocks any query from specifying its own external_location — exactly what CTAS needs, since each mart is meant to land in its own dedicated marts/&lt;name&gt;/ prefix rather than one shared location. Fixed by setting it to false; the workgroup's configured OutputLocation still serves as the default for the DROP TABLE statements.</w:t>
+      </w:r>
+    </w:p>
+    <w:p>
+      <w:pPr>
+        <w:pStyle w:val="ListParagraph"/>
+        <w:numPr>
+          <w:ilvl w:val="0"/>
+          <w:numId w:val="1"/>
+        </w:numPr>
+        <w:spacing w:after="80"/>
+      </w:pPr>
+      <w:r>
+        <w:t xml:space="preserve">3. The all-null calendly_bookings.channel column (Section 11) got cataloged as INTEGER, causing TYPE_MISMATCH errors on every query that compared or coalesced it against a real VARCHAR value. Fixed with defensive CAST(channel AS VARCHAR) in every affected query — kept even after the root-cause dtype fix landed in the Glue transform script, as belt-and-suspenders protection against the same quirk recurring on any other currently-all-null column.</w:t>
+      </w:r>
+    </w:p>
+    <w:p>
+      <w:pPr>
+        <w:spacing w:after="120"/>
+      </w:pPr>
+      <w:r>
+        <w:t xml:space="preserve">All 7 marts succeeded on the first run after these three fixes, verified directly against real data via Athena spot-checks: daily_calls_booked_by_source showed real daily counts (34–113 bookings/day), meeting_load_per_employee showed real named employees with sane meeting counts, and channel_performance_summary showed leads_created (89–135/day) tracking alongside bookings (34–113/day) on the same dates — confirming the CRM date-substring join (the least-tested piece of SQL in this build, given crm_leads_enriched.date_created is a plain string, never converted to a real timestamp) actually works against real data, not just in theory.</w:t>
+      </w:r>
+    </w:p>
+    <w:p>
+      <w:pPr>
+        <w:pStyle w:val="Heading1"/>
+        <w:spacing w:after="150" w:before="300"/>
+      </w:pPr>
+      <w:r>
+        <w:t xml:space="preserve">14. QuickSight Dashboard</w:t>
+      </w:r>
+    </w:p>
+    <w:p>
+      <w:pPr>
+        <w:spacing w:after="120"/>
+      </w:pPr>
+      <w:r>
+        <w:t xml:space="preserve">Per Section 17's SME-confirmed decision, QuickSight (not Streamlit) reads the marts/ tables via Athena to render dashboards — one dataset per mart, direct-query mode (not SPICE) given the marts were still being actively iterated on during dashboard construction. QuickSight was already enabled on this AWS account (Enterprise-tier 30-day trial).</w:t>
+      </w:r>
+    </w:p>
+    <w:p>
+      <w:pPr>
+        <w:spacing w:after="120"/>
+      </w:pPr>
+      <w:r>
+        <w:t xml:space="preserve">Connecting QuickSight to the insightflow-workgroup Athena workgroup required two rounds of IAM fixes on QuickSight's own AWS-managed service role (aws-quicksight-service-role-v0) — distinct from every other IAM fix in this project, since this role is not defined in any of this project's CloudFormation templates and is instead managed through QuickSight's own “Security &amp; Permissions” console UI:</w:t>
+      </w:r>
+    </w:p>
+    <w:p>
+      <w:pPr>
+        <w:pStyle w:val="ListParagraph"/>
+        <w:numPr>
+          <w:ilvl w:val="0"/>
+          <w:numId w:val="1"/>
+        </w:numPr>
+        <w:spacing w:after="80"/>
+      </w:pPr>
+      <w:r>
+        <w:t xml:space="preserve">The customer-managed policy QuickSight auto-generates for custom S3 bucket access (AWSQuickSightS3Policy) was stale after adding the InsightFlow bucket through the UI — it still only referenced two buckets from prior capstones. The UI's own save step for this specific sub-panel didn't take effect the first time; had to be redone, then verified by reading the actual IAM policy JSON directly rather than trusting the checkbox state.</w:t>
+      </w:r>
+    </w:p>
+    <w:p>
+      <w:pPr>
+        <w:pStyle w:val="ListParagraph"/>
+        <w:numPr>
+          <w:ilvl w:val="0"/>
+          <w:numId w:val="1"/>
+        </w:numPr>
+        <w:spacing w:after="80"/>
+      </w:pPr>
+      <w:r>
+        <w:t xml:space="preserve">Even after the bucket was correctly added, the policy was missing s3:GetBucketLocation (the same class of gap as the marts_builder Lambda's IAM issue, Section 13, but on a completely different, AWS-managed role) and s3:PutObject scoped to athena-results/* — QuickSight needs to write its own query-result staging files there, not just read from marts/. Both added as new statements to the customer-managed policy directly, since it's safe to hand-edit (unlike the AWS-managed AWSQuickSightAthenaAccess policy, which only covers Athena's default auto-generated results bucket, not a workgroup with a custom output location like this project's).</w:t>
+      </w:r>
+    </w:p>
+    <w:p>
+      <w:pPr>
+        <w:spacing w:after="120"/>
+      </w:pPr>
+      <w:r>
+        <w:t xml:space="preserve">Once connected, one visual was built per mart (7 total): a stacked bar chart for daily_calls_booked_by_source, a combo chart (bars + line) for both bookings_trend_over_time and channel_performance_summary, a heat map for booking_volume_by_timeslot (with a calculated field forcing Monday–Sunday ordering, since QuickSight sorts text fields alphabetically by default and no built-in custom-sort option was available for this chart type), a horizontal bar chart for meeting_load_per_employee, and pie/donut charts for channel_attribution and cost_per_booking_by_channel given both currently show only a single real category (Section 18).</w:t>
+      </w:r>
+    </w:p>
+    <w:p>
+      <w:pPr>
+        <w:pStyle w:val="Heading1"/>
+        <w:spacing w:after="150" w:before="300"/>
+      </w:pPr>
+      <w:r>
+        <w:t xml:space="preserve">15. Cost Considerations</w:t>
       </w:r>
     </w:p>
     <w:tbl>
@@ -1798,7 +2040,7 @@
                 <w:sz w:val="20"/>
                 <w:szCs w:val="20"/>
               </w:rPr>
-              <w:t xml:space="preserve">Confirmed acceptable by SME — see Section 13</w:t>
+              <w:t xml:space="preserve">Confirmed acceptable by SME — see Section 17</w:t>
             </w:r>
           </w:p>
         </w:tc>
@@ -1910,7 +2152,7 @@
         <w:spacing w:after="150" w:before="300"/>
       </w:pPr>
       <w:r>
-        <w:t xml:space="preserve">12. Alternatives Considered</w:t>
+        <w:t xml:space="preserve">16. Alternatives Considered</w:t>
       </w:r>
     </w:p>
     <w:tbl>
@@ -2062,7 +2304,7 @@
                 <w:sz w:val="20"/>
                 <w:szCs w:val="20"/>
               </w:rPr>
-              <w:t xml:space="preserve">Step Functions was proposed for its native sequencing, per-state retry, execution-name idempotency, and execution-history observability. SME direction was explicit and specific to this flow: use the SQS delay-queue pattern named in the brief; Step Functions/EventBridge Scheduler are unnecessary absent a specific reason. Implemented per that guidance — idempotency and DLQ handling are built in code instead of inherited from the platform (Section 6, Section 13)</w:t>
+              <w:t xml:space="preserve">Step Functions was proposed for its native sequencing, per-state retry, execution-name idempotency, and execution-history observability. SME direction was explicit and specific to this flow: use the SQS delay-queue pattern named in the brief; Step Functions/EventBridge Scheduler are unnecessary absent a specific reason. Implemented per that guidance — idempotency and DLQ handling are built in code instead of inherited from the platform (Section 6, Section 17)</w:t>
             </w:r>
           </w:p>
         </w:tc>
@@ -2128,7 +2370,7 @@
                 <w:sz w:val="20"/>
                 <w:szCs w:val="20"/>
               </w:rPr>
-              <w:t xml:space="preserve">SME confirmed both are acceptable (Section 13). Lakehouse pattern retained: matches both prior capstones and avoids provisioning a cluster for a 7-day, low-volume workload, given dbt and Snowflake are both prohibited</w:t>
+              <w:t xml:space="preserve">SME confirmed both are acceptable (Section 17). Lakehouse pattern retained: matches both prior capstones and avoids provisioning a cluster for a 7-day, low-volume workload, given dbt and Snowflake are both prohibited</w:t>
             </w:r>
           </w:p>
         </w:tc>
@@ -2194,7 +2436,7 @@
                 <w:sz w:val="20"/>
                 <w:szCs w:val="20"/>
               </w:rPr>
-              <w:t xml:space="preserve">SME confirmed QuickSight is acceptable and Streamlit hosting is not mandatory (Section 13); QuickSight also matches precedent from the prior two capstones</w:t>
+              <w:t xml:space="preserve">SME confirmed QuickSight is acceptable and Streamlit hosting is not mandatory (Section 17); QuickSight also matches precedent from the prior two capstones</w:t>
             </w:r>
           </w:p>
         </w:tc>
@@ -2260,7 +2502,7 @@
                 <w:sz w:val="20"/>
                 <w:szCs w:val="20"/>
               </w:rPr>
-              <w:t xml:space="preserve">SME confirmed either is acceptable (Section 13); Slack setup has no domain-verification/sandbox overhead</w:t>
+              <w:t xml:space="preserve">SME confirmed either is acceptable (Section 17); Slack setup has no domain-verification/sandbox overhead</w:t>
             </w:r>
           </w:p>
         </w:tc>
@@ -2338,7 +2580,7 @@
         <w:spacing w:after="150" w:before="300"/>
       </w:pPr>
       <w:r>
-        <w:t xml:space="preserve">13. Resolved via SME Response</w:t>
+        <w:t xml:space="preserve">17. Resolved via SME Response</w:t>
       </w:r>
     </w:p>
     <w:p>
@@ -2668,7 +2910,7 @@
                 <w:sz w:val="20"/>
                 <w:szCs w:val="20"/>
               </w:rPr>
-              <w:t xml:space="preserve">SQS delay queue implemented per Section 6; Step Functions moved to Section 12 as a documented, not-implemented alternative</w:t>
+              <w:t xml:space="preserve">SQS delay queue implemented per Section 6; Step Functions moved to Section 16 as a documented, not-implemented alternative</w:t>
             </w:r>
           </w:p>
         </w:tc>
@@ -3030,7 +3272,7 @@
         <w:spacing w:after="150" w:before="300"/>
       </w:pPr>
       <w:r>
-        <w:t xml:space="preserve">14. Open Items — Still Pending SME Confirmation</w:t>
+        <w:t xml:space="preserve">18. Open Items — Still Pending SME Confirmation</w:t>
       </w:r>
     </w:p>
     <w:p>
@@ -3133,7 +3375,20 @@
         <w:spacing w:after="80"/>
       </w:pPr>
       <w:r>
-        <w:t xml:space="preserve">7. Calendly webhook signature (project decision, not SME confirmation): SME confirmed (Aug 12 follow-up) that the CRM/Close endpoint uses no signature at all, by design — resolved, see Section 13. The same wasn't separately confirmed for Calendly, but is now treated as resolved by project decision rather than left open: given the SME response pattern on this project and that Calendly's signing_key is genuinely optional at subscription creation (so “none was ever set” is plausible here too, not just “not yet sent”), REQUIRE_SIGNATURE_VALIDATION now defaults to “false” for Calendly as well. This is explicitly the project owner's judgment call, documented as such rather than attributed to the SME — reversible via the same flag if evidence emerges otherwise.</w:t>
+        <w:t xml:space="preserve">7. Calendly webhook signature (project decision, not SME confirmation): SME confirmed (Aug 12 follow-up) that the CRM/Close endpoint uses no signature at all, by design — resolved, see Section 17. The same wasn't separately confirmed for Calendly, but is now treated as resolved by project decision rather than left open: given the SME response pattern on this project and that Calendly's signing_key is genuinely optional at subscription creation (so “none was ever set” is plausible here too, not just “not yet sent”), REQUIRE_SIGNATURE_VALIDATION now defaults to “false” for Calendly as well. This is explicitly the project owner's judgment call, documented as such rather than attributed to the SME — reversible via the same flag if evidence emerges otherwise.</w:t>
+      </w:r>
+    </w:p>
+    <w:p>
+      <w:pPr>
+        <w:pStyle w:val="ListParagraph"/>
+        <w:numPr>
+          <w:ilvl w:val="0"/>
+          <w:numId w:val="1"/>
+        </w:numPr>
+        <w:spacing w:after="80"/>
+      </w:pPr>
+      <w:r>
+        <w:t xml:space="preserve">8. Calendly campaign_raw contains IP addresses, not channel identifiers, on a subset of real bookings: of ~407 real bookings, 391 have no tracking data at all (expected — organic/referred, no ad click). But the 16 that DO have a non-null tracking.utm_campaign value show what looks like the visitor's own IP address (e.g. “2600:4040:7b94:f600:98a8:6bbe:2cd5:6c6c”, “136.228.203.94”) rather than a channel name like facebook_paid_ads. Confirmed directly via an Athena GROUP BY on campaign_raw — this rules out a bug in this project's channel-matching logic (which correctly checks the right field and correctly finds no match for these values) and points instead at the paid-ad campaign's own booking-link/UTM template using the wrong token upstream, on the ad platform or landing-page side, not something this pipeline can infer or correct. Raised with the SME (Aug 2026); awaiting response on whether the campaign link configuration can be corrected, or whether a different field should be read instead.</w:t>
       </w:r>
     </w:p>
     <w:p>
@@ -3142,98 +3397,98 @@
         <w:spacing w:after="150" w:before="300"/>
       </w:pPr>
       <w:r>
-        <w:t xml:space="preserve">15. Next Steps</w:t>
-      </w:r>
-    </w:p>
-    <w:p>
-      <w:pPr>
-        <w:pStyle w:val="ListParagraph"/>
-        <w:numPr>
-          <w:ilvl w:val="0"/>
-          <w:numId w:val="1"/>
-        </w:numPr>
-        <w:spacing w:after="80"/>
-      </w:pPr>
-      <w:r>
-        <w:t xml:space="preserve">Provision the two API Gateway endpoints (CRM, Calendly) and the CRM webhook + consumer Lambda functions.</w:t>
-      </w:r>
-    </w:p>
-    <w:p>
-      <w:pPr>
-        <w:pStyle w:val="ListParagraph"/>
-        <w:numPr>
-          <w:ilvl w:val="0"/>
-          <w:numId w:val="1"/>
-        </w:numPr>
-        <w:spacing w:after="80"/>
-      </w:pPr>
-      <w:r>
-        <w:t xml:space="preserve">Foundation infrastructure deployed (S3 bucket, IAM roles, SQS delay queue + DLQ, placeholder secrets) via infrastructure/foundation.yaml — verified against the stack's Outputs and each console on August 10, 2026.</w:t>
-      </w:r>
-    </w:p>
-    <w:p>
-      <w:pPr>
-        <w:pStyle w:val="ListParagraph"/>
-        <w:numPr>
-          <w:ilvl w:val="0"/>
-          <w:numId w:val="1"/>
-        </w:numPr>
-        <w:spacing w:after="80"/>
-      </w:pPr>
-      <w:r>
-        <w:t xml:space="preserve">Coordinate with Avirup on webhook creation for Close and Calendly once endpoint URLs are ready.</w:t>
-      </w:r>
-    </w:p>
-    <w:p>
-      <w:pPr>
-        <w:pStyle w:val="ListParagraph"/>
-        <w:numPr>
-          <w:ilvl w:val="0"/>
-          <w:numId w:val="1"/>
-        </w:numPr>
-        <w:spacing w:after="80"/>
-      </w:pPr>
-      <w:r>
-        <w:t xml:space="preserve">Build and test the CRM SQS-based flow end-to-end against a small subset of synthetic lead events before enabling the live Close webhook — including a deliberate DLQ/failure test to validate the fault-tolerance mechanism.</w:t>
-      </w:r>
-    </w:p>
-    <w:p>
-      <w:pPr>
-        <w:pStyle w:val="ListParagraph"/>
-        <w:numPr>
-          <w:ilvl w:val="0"/>
-          <w:numId w:val="1"/>
-        </w:numPr>
-        <w:spacing w:after="80"/>
-      </w:pPr>
-      <w:r>
-        <w:t xml:space="preserve">Stand up the Wistia and Calendly-spend scheduled pulls; validate incremental watermarking.</w:t>
-      </w:r>
-    </w:p>
-    <w:p>
-      <w:pPr>
-        <w:pStyle w:val="ListParagraph"/>
-        <w:numPr>
-          <w:ilvl w:val="0"/>
-          <w:numId w:val="1"/>
-        </w:numPr>
-        <w:spacing w:after="80"/>
-      </w:pPr>
-      <w:r>
-        <w:t xml:space="preserve">Begin the 7-day operational window only after the ingestion layer is validated for all three sources.</w:t>
-      </w:r>
-    </w:p>
-    <w:p>
-      <w:pPr>
-        <w:pStyle w:val="ListParagraph"/>
-        <w:numPr>
-          <w:ilvl w:val="0"/>
-          <w:numId w:val="1"/>
-        </w:numPr>
-        <w:spacing w:after="80"/>
-      </w:pPr>
-      <w:r>
-        <w:t xml:space="preserve">Raise the five remaining open items (Section 14) with the SMEs as a follow-up, separate from implementation start.</w:t>
+        <w:t xml:space="preserve">19. Next Steps</w:t>
+      </w:r>
+    </w:p>
+    <w:p>
+      <w:pPr>
+        <w:pStyle w:val="ListParagraph"/>
+        <w:numPr>
+          <w:ilvl w:val="0"/>
+          <w:numId w:val="1"/>
+        </w:numPr>
+        <w:spacing w:after="80"/>
+      </w:pPr>
+      <w:r>
+        <w:t xml:space="preserve">All four pipeline layers — ingestion (CRM, Calendly, Wistia), Glue transform, Glue Data Catalog, and Athena marts — are built, deployed, and verified against real production data as of this writing. QuickSight dashboard built with one visual per mart (Section 14).</w:t>
+      </w:r>
+    </w:p>
+    <w:p>
+      <w:pPr>
+        <w:pStyle w:val="ListParagraph"/>
+        <w:numPr>
+          <w:ilvl w:val="0"/>
+          <w:numId w:val="1"/>
+        </w:numPr>
+        <w:spacing w:after="80"/>
+      </w:pPr>
+      <w:r>
+        <w:t xml:space="preserve">Awaiting SME response on Item 8 (Section 18) — the campaign_raw/IP-address finding — before treating channel-level marketing metrics as trustworthy for reporting; the pipeline itself handles the current data correctly (COALESCE to organic_unknown), this is a data-source question, not a pipeline gap.</w:t>
+      </w:r>
+    </w:p>
+    <w:p>
+      <w:pPr>
+        <w:pStyle w:val="ListParagraph"/>
+        <w:numPr>
+          <w:ilvl w:val="0"/>
+          <w:numId w:val="1"/>
+        </w:numPr>
+        <w:spacing w:after="80"/>
+      </w:pPr>
+      <w:r>
+        <w:t xml:space="preserve">Consider whether Wistia's processed/ tables (media metadata, engagement, events) warrant their own marts — currently ingested and transformed but not yet surfaced in Athena marts or QuickSight, since the original Section 9/10 scope was Calendly-metrics-plus-cross-source-correlation, not a dedicated Wistia analytics layer.</w:t>
+      </w:r>
+    </w:p>
+    <w:p>
+      <w:pPr>
+        <w:pStyle w:val="ListParagraph"/>
+        <w:numPr>
+          <w:ilvl w:val="0"/>
+          <w:numId w:val="1"/>
+        </w:numPr>
+        <w:spacing w:after="80"/>
+      </w:pPr>
+      <w:r>
+        <w:t xml:space="preserve">Re-enable REQUIRE_SIGNATURE_VALIDATION for Calendly (Item 7, Section 18) if the SME confirms a signing_key was in fact set on that subscription.</w:t>
+      </w:r>
+    </w:p>
+    <w:p>
+      <w:pPr>
+        <w:pStyle w:val="ListParagraph"/>
+        <w:numPr>
+          <w:ilvl w:val="0"/>
+          <w:numId w:val="1"/>
+        </w:numPr>
+        <w:spacing w:after="80"/>
+      </w:pPr>
+      <w:r>
+        <w:t xml:space="preserve">Turn NOTIFY_SLACK back on (currently manually toggled off/on around backlog-drain events) once real traffic volume settles into a steady, non-bursty pattern.</w:t>
+      </w:r>
+    </w:p>
+    <w:p>
+      <w:pPr>
+        <w:pStyle w:val="ListParagraph"/>
+        <w:numPr>
+          <w:ilvl w:val="0"/>
+          <w:numId w:val="1"/>
+        </w:numPr>
+        <w:spacing w:after="80"/>
+      </w:pPr>
+      <w:r>
+        <w:t xml:space="preserve">Record the short video/presentation explaining the work, per the requirements doc's submission section — a deliverable distinct from the code/infrastructure itself, easy to lose track of amid the build.</w:t>
+      </w:r>
+    </w:p>
+    <w:p>
+      <w:pPr>
+        <w:pStyle w:val="ListParagraph"/>
+        <w:numPr>
+          <w:ilvl w:val="0"/>
+          <w:numId w:val="1"/>
+        </w:numPr>
+        <w:spacing w:after="80"/>
+      </w:pPr>
+      <w:r>
+        <w:t xml:space="preserve">Clean up the synthetic test lead (lead_test123) from processed/crm_leads_enriched/ before treating marts output as production-clean, if not already done.</w:t>
       </w:r>
     </w:p>
     <w:sectPr>

</xml_diff>

<commit_message>
Added updated design doc and video script.
</commit_message>
<xml_diff>
--- a/Documentation/InsightFlow_Solution_Design.docx
+++ b/Documentation/InsightFlow_Solution_Design.docx
@@ -79,7 +79,7 @@
         <w:t xml:space="preserve">Approval gate: </w:t>
       </w:r>
       <w:r>
-        <w:t xml:space="preserve">the project brief requires the architecture and data model to be presented for SME approval before implementation proceeds. This document, together with the accompanying workflow diagram, is that submission. The initial draft proceeded on documented working assumptions where SME answers were not yet available; SME responses received on August 10, 2026 are incorporated throughout and summarized in Section 17. A short list of items remains genuinely open and is tracked in Section 18.</w:t>
+        <w:t xml:space="preserve">the project brief requires the architecture and data model to be presented for SME approval before implementation proceeds. This document, together with the accompanying workflow diagram, is that submission. The initial draft proceeded on documented working assumptions where SME answers were not yet available; SME responses received on August 10, 2026 are incorporated throughout and summarized in Section 18. A short list of items remains genuinely open and is tracked in Section 19.</w:t>
       </w:r>
     </w:p>
     <w:p>
@@ -454,7 +454,7 @@
         <w:spacing w:after="120"/>
       </w:pPr>
       <w:r>
-        <w:t xml:space="preserve">Note: Calendly is a hybrid source — booking events arrive real-time via webhook, but the cost data needed to compute Cost-Per-Booking only exists as a once-daily batch file. SME response confirmed this reading directly: Calendly webhook ingestion is real-time, event-driven, while downstream transformation involving the daily spend data can be batch (Section 17).</w:t>
+        <w:t xml:space="preserve">Note: Calendly is a hybrid source — booking events arrive real-time via webhook, but the cost data needed to compute Cost-Per-Booking only exists as a once-daily batch file. SME response confirmed this reading directly: Calendly webhook ingestion is real-time, event-driven, while downstream transformation involving the daily spend data can be batch (Section 18).</w:t>
       </w:r>
     </w:p>
     <w:p>
@@ -471,23 +471,23 @@
         <w:spacing w:after="120"/>
       </w:pPr>
       <w:r>
-        <w:t xml:space="preserve">Serverless, event-driven medallion architecture on S3. SME confirmed either AWS or Azure is acceptable for this project; AWS is retained throughout this document, consistent with the existing stack and prior capstones (Section 17). No persistent database or always-on compute; storage and compute are decoupled the same way as the Global Partners and Healthcare Metrics capstones.</w:t>
-      </w:r>
-    </w:p>
-    <w:p>
-      <w:pPr>
-        <w:spacing w:after="120"/>
-      </w:pPr>
-      <w:r>
-        <w:t xml:space="preserve">Ingestion is split by pattern: webhook sources (Close, Calendly bookings) land through API Gateway + Lambda into S3 raw/ the moment an event arrives. Scheduled sources (Wistia, Calendly spend file) are pulled by EventBridge-triggered Lambdas on a cron schedule — this scheduled pattern is unaffected by SME guidance on the CRM flow (see below) since it was never part of the delay-mechanism question. The CRM per-lead flow uses an SQS delay queue rather than an orchestrator: SME direction was explicit that the SQS delay-queue pattern named in the brief should be used, and that Step Functions or EventBridge Scheduler are unnecessary for this flow absent a specific reason (Section 17).</w:t>
-      </w:r>
-    </w:p>
-    <w:p>
-      <w:pPr>
-        <w:spacing w:after="120"/>
-      </w:pPr>
-      <w:r>
-        <w:t xml:space="preserve">Glue Python Shell (or Glue ETL/PySpark if volume across all three sources exceeds the single-node comfort range — to be confirmed once real data volumes are known) transforms raw JSON into cleaned, typed Parquet in processed/. Athena CTAS aggregates processed/ into metric-ready tables in marts/. QuickSight reads marts/ via Athena to render the cross-source dashboards — SME confirmed QuickSight is acceptable and Streamlit hosting is not mandatory (Section 17).</w:t>
+        <w:t xml:space="preserve">Serverless, event-driven medallion architecture on S3. SME confirmed either AWS or Azure is acceptable for this project; AWS is retained throughout this document, consistent with the existing stack and prior capstones (Section 18). No persistent database or always-on compute; storage and compute are decoupled the same way as the Global Partners and Healthcare Metrics capstones.</w:t>
+      </w:r>
+    </w:p>
+    <w:p>
+      <w:pPr>
+        <w:spacing w:after="120"/>
+      </w:pPr>
+      <w:r>
+        <w:t xml:space="preserve">Ingestion is split by pattern: webhook sources (Close, Calendly bookings) land through API Gateway + Lambda into S3 raw/ the moment an event arrives. Scheduled sources (Wistia, Calendly spend file) are pulled by EventBridge-triggered Lambdas on a cron schedule — this scheduled pattern is unaffected by SME guidance on the CRM flow (see below) since it was never part of the delay-mechanism question. The CRM per-lead flow uses an SQS delay queue rather than an orchestrator: SME direction was explicit that the SQS delay-queue pattern named in the brief should be used, and that Step Functions or EventBridge Scheduler are unnecessary for this flow absent a specific reason (Section 18).</w:t>
+      </w:r>
+    </w:p>
+    <w:p>
+      <w:pPr>
+        <w:spacing w:after="120"/>
+      </w:pPr>
+      <w:r>
+        <w:t xml:space="preserve">Glue Python Shell (or Glue ETL/PySpark if volume across all three sources exceeds the single-node comfort range — to be confirmed once real data volumes are known) transforms raw JSON into cleaned, typed Parquet in processed/. Athena CTAS aggregates processed/ into metric-ready tables in marts/. QuickSight reads marts/ via Athena to render the cross-source dashboards — SME confirmed QuickSight is acceptable and Streamlit hosting is not mandatory (Section 18).</w:t>
       </w:r>
     </w:p>
     <w:p>
@@ -511,7 +511,7 @@
         <w:t xml:space="preserve">Ingestion — API Gateway + Lambda (CRM, Calendly webhooks): </w:t>
       </w:r>
       <w:r>
-        <w:t xml:space="preserve">Both Close and Calendly deliver events via outbound webhook POST. API Gateway provides the public HTTPS endpoint; Lambda validates the signature (Close-Sig-Hash / Calendly signing secret) and writes the raw event to S3. This is the only practical pattern for receiving third-party webhooks on AWS without standing up always-on compute. SME confirmed Avirup will assist directly with webhook creation on the Close/Calendly side once the endpoint URLs are ready (Section 17).</w:t>
+        <w:t xml:space="preserve">Both Close and Calendly deliver events via outbound webhook POST. API Gateway provides the public HTTPS endpoint; Lambda validates the signature (Close-Sig-Hash / Calendly signing secret) and writes the raw event to S3. This is the only practical pattern for receiving third-party webhooks on AWS without standing up always-on compute. SME confirmed Avirup will assist directly with webhook creation on the Close/Calendly side once the endpoint URLs are ready (Section 18).</w:t>
       </w:r>
     </w:p>
     <w:p>
@@ -526,7 +526,7 @@
         <w:t xml:space="preserve">Delay mechanism — SQS delay queue (CRM lead flow): </w:t>
       </w:r>
       <w:r>
-        <w:t xml:space="preserve">The CRM flow needs a 10-minute pause between landing the webhook event and looking up the lead owner, because owner assignment happens asynchronously in Close after lead creation — SME confirmed this reading directly (Section 17). Per SME direction, this is implemented as the SQS delay-queue pattern named in the brief, not Step Functions or EventBridge Scheduler: the webhook Lambda sends a message (lead_id + event metadata) to a standard SQS queue with DelaySeconds=600; a second Lambda, wired to the queue via an event-source mapping, only receives the message once the 10-minute delay has elapsed, and performs the lookup, merge, and notify steps in sequence within that single invocation. Because SQS standard queues are at-least-once delivery, idempotency is handled in code rather than by the platform: the consumer Lambda checks for an existing processed/crm_leads_enriched/ record for that lead_id before writing, so a redelivered message is a no-op rather than a duplicate. The queue's redrive policy routes messages to a dedicated dead-letter queue after 3 failed processing attempts, with a CloudWatch alarm on DLQ depth — this is the mechanism used to demonstrate the brief's fault-tolerance/recovery requirement, in place of Step Functions' execution history. A fuller Step Functions-based design was proposed and considered (Section 16) but not implemented, per direct SME guidance that it isn't needed here absent a specific reason.</w:t>
+        <w:t xml:space="preserve">The CRM flow needs a 10-minute pause between landing the webhook event and looking up the lead owner, because owner assignment happens asynchronously in Close after lead creation — SME confirmed this reading directly (Section 18). Per SME direction, this is implemented as the SQS delay-queue pattern named in the brief, not Step Functions or EventBridge Scheduler: the webhook Lambda sends a message (lead_id + event metadata) to a standard SQS queue with DelaySeconds=600; a second Lambda, wired to the queue via an event-source mapping, only receives the message once the 10-minute delay has elapsed, and performs the lookup, merge, and notify steps in sequence within that single invocation. Because SQS standard queues are at-least-once delivery, idempotency is handled in code rather than by the platform: the consumer Lambda checks for an existing processed/crm_leads_enriched/ record for that lead_id before writing, so a redelivered message is a no-op rather than a duplicate. The queue's redrive policy routes messages to a dedicated dead-letter queue after 3 failed processing attempts, with a CloudWatch alarm on DLQ depth — this is the mechanism used to demonstrate the brief's fault-tolerance/recovery requirement, in place of Step Functions' execution history. A fuller Step Functions-based design was proposed and considered (Section 17) but not implemented, per direct SME guidance that it isn't needed here absent a specific reason.</w:t>
       </w:r>
     </w:p>
     <w:p>
@@ -616,7 +616,7 @@
         <w:t xml:space="preserve">Dashboard — Amazon QuickSight: </w:t>
       </w:r>
       <w:r>
-        <w:t xml:space="preserve">SME confirmed QuickSight is acceptable in place of Streamlit and that Streamlit's public-hosting requirement is not mandatory (Section 17), matching precedent from the last two capstones.</w:t>
+        <w:t xml:space="preserve">SME confirmed QuickSight is acceptable in place of Streamlit and that Streamlit's public-hosting requirement is not mandatory (Section 18), matching precedent from the last two capstones.</w:t>
       </w:r>
     </w:p>
     <w:p>
@@ -631,7 +631,7 @@
         <w:t xml:space="preserve">Notifications — Slack incoming webhook: </w:t>
       </w:r>
       <w:r>
-        <w:t xml:space="preserve">SME confirmed either Slack or email is acceptable (Section 17). Slack is used because a workspace incoming-webhook URL is a five-minute setup, versus SES's domain-verification or sandbox-address overhead. Built behind a single notification-adapter function so switching to SES later is a one-function change, not a redesign.</w:t>
+        <w:t xml:space="preserve">SME confirmed either Slack or email is acceptable (Section 18). Slack is used because a workspace incoming-webhook URL is a five-minute setup, versus SES's domain-verification or sandbox-address overhead. Built behind a single notification-adapter function so switching to SES later is a one-function change, not a redesign.</w:t>
       </w:r>
     </w:p>
     <w:p>
@@ -646,7 +646,7 @@
         <w:t xml:space="preserve">Security — Secrets Manager: </w:t>
       </w:r>
       <w:r>
-        <w:t xml:space="preserve">SME confirmed the Wistia API token must be stored in Secrets Manager and never hardcoded or pushed to GitHub (Section 17). Close/Calendly webhook signing secrets are stored the same way.</w:t>
+        <w:t xml:space="preserve">SME confirmed the Wistia API token must be stored in Secrets Manager and never hardcoded or pushed to GitHub (Section 18). Close/Calendly webhook signing secrets are stored the same way.</w:t>
       </w:r>
     </w:p>
     <w:p>
@@ -661,7 +661,7 @@
         <w:t xml:space="preserve">Provisioning — CloudFormation (infrastructure/foundation.yaml): </w:t>
       </w:r>
       <w:r>
-        <w:t xml:space="preserve">The S3 bucket, SQS delay queue + DLQ, placeholder Secrets Manager secrets, and all 7 least-privilege IAM roles are defined as a single CloudFormation template rather than created by hand in the console. This gives every permission change a diffable, reviewable history in git instead of an unrecorded console click — directly addressing the recurring pattern noted across prior capstones of IAM gaps being patched reactively as they're discovered. The template is deployed once, manually (console upload), rather than through GitHub Actions: OIDC federation requires an IAM trust relationship to already exist before GitHub can assume any role, so the very first deploy of foundational infrastructure is necessarily a manual bootstrap step in any AWS account, not a shortcut specific to this project. The OIDC identity provider and deploy role are deferred to when the Lambda/Glue CI/CD pipeline is built (Section 19), since that is the piece the SME confirmed is the actual minimum CI/CD bar — not the one-time foundation stack. Deployed and verified August 10, 2026 (stack: insightflow-foundation).</w:t>
+        <w:t xml:space="preserve">The S3 bucket, SQS delay queue + DLQ, placeholder Secrets Manager secrets, and all 7 least-privilege IAM roles are defined as a single CloudFormation template rather than created by hand in the console. This gives every permission change a diffable, reviewable history in git instead of an unrecorded console click — directly addressing the recurring pattern noted across prior capstones of IAM gaps being patched reactively as they're discovered. The template is deployed once, manually (console upload), rather than through GitHub Actions: OIDC federation requires an IAM trust relationship to already exist before GitHub can assume any role, so the very first deploy of foundational infrastructure is necessarily a manual bootstrap step in any AWS account, not a shortcut specific to this project. The OIDC identity provider and deploy role are deferred to when the Lambda/Glue CI/CD pipeline is built (Section 20), since that is the piece the SME confirmed is the actual minimum CI/CD bar — not the one-time foundation stack. Deployed and verified August 10, 2026 (stack: insightflow-foundation).</w:t>
       </w:r>
     </w:p>
     <w:p>
@@ -727,7 +727,7 @@
         <w:spacing w:after="120"/>
       </w:pPr>
       <w:r>
-        <w:t xml:space="preserve">Per SME direction, this flow uses the SQS delay-queue pattern named in the brief rather than an orchestrator — Step Functions and EventBridge Scheduler are not used here (Section 17).</w:t>
+        <w:t xml:space="preserve">Per SME direction, this flow uses the SQS delay-queue pattern named in the brief rather than an orchestrator — Step Functions and EventBridge Scheduler are not used here (Section 18).</w:t>
       </w:r>
     </w:p>
     <w:p>
@@ -779,7 +779,7 @@
         <w:spacing w:after="80"/>
       </w:pPr>
       <w:r>
-        <w:t xml:space="preserve">That Lambda reads the corresponding {lead_id}.json from the public dea-lead-owner S3 bucket, at the exact URL pattern given in the requirements doc: https://dea-lead-owner.s3.us-east-1.amazonaws.com/{lead_id}.json (an earlier build of this Lambda defaulted to a URL missing the region in the hostname — caught and fixed in a direct review against the requirements doc). SME confirmed this bucket holds Day-1 (one-day-back) data, and that once the webhook is created, lookups against it are keyed by lead_id (Section 17). Because the bucket refreshes on a daily cycle rather than in step with the 10-minute wait, a lead created today may not yet have an owner reflected in the file the pipeline reads; per SME guidance this is the intended lookup pattern, so the merge step treats a missing owner as a valid outcome (lead_owner: null) rather than an error — no additional polling or extended-wait logic is introduced beyond what the brief specifies.</w:t>
+        <w:t xml:space="preserve">That Lambda reads the corresponding {lead_id}.json from the public dea-lead-owner S3 bucket, at the exact URL pattern given in the requirements doc: https://dea-lead-owner.s3.us-east-1.amazonaws.com/{lead_id}.json (an earlier build of this Lambda defaulted to a URL missing the region in the hostname — caught and fixed in a direct review against the requirements doc). SME confirmed this bucket holds Day-1 (one-day-back) data, and that once the webhook is created, lookups against it are keyed by lead_id (Section 18). Because the bucket refreshes on a daily cycle rather than in step with the 10-minute wait, a lead created today may not yet have an owner reflected in the file the pipeline reads; per SME guidance this is the intended lookup pattern, so the merge step treats a missing owner as a valid outcome (lead_owner: null) rather than an error — no additional polling or extended-wait logic is introduced beyond what the brief specifies.</w:t>
       </w:r>
     </w:p>
     <w:p>
@@ -844,7 +844,7 @@
         <w:spacing w:after="80"/>
       </w:pPr>
       <w:r>
-        <w:t xml:space="preserve">Operational note, observed directly: Close retries failed deliveries for up to 72 hours, so a period of signature-validation failures (Section 17) meant a real retry backlog had accumulated. Disabling validation caused that entire backlog to succeed at once, not just new events going forward — a burst of dozens of leads landing within seconds of each other, which then produced a correspondingly large burst of Slack notifications roughly 10 minutes later (the delay queue doesn't smooth out bursts, it just uniformly shifts them). Not a bug; a predictable consequence of clearing a multi-day blocker. NOTIFY_SLACK (default “true”) was added as a volume-control toggle for exactly this situation — lets processing (S3 write, idempotency) continue while suppressing the notification fan-out during a large backlog drain, without touching REQUIRE_SIGNATURE_VALIDATION's security semantics.</w:t>
+        <w:t xml:space="preserve">Operational note, observed directly: Close retries failed deliveries for up to 72 hours, so a period of signature-validation failures (Section 18) meant a real retry backlog had accumulated. Disabling validation caused that entire backlog to succeed at once, not just new events going forward — a burst of dozens of leads landing within seconds of each other, which then produced a correspondingly large burst of Slack notifications roughly 10 minutes later (the delay queue doesn't smooth out bursts, it just uniformly shifts them). Not a bug; a predictable consequence of clearing a multi-day blocker. NOTIFY_SLACK (default “true”) was added as a volume-control toggle for exactly this situation — lets processing (S3 write, idempotency) continue while suppressing the notification fan-out during a large backlog drain, without touching REQUIRE_SIGNATURE_VALIDATION's security semantics.</w:t>
       </w:r>
     </w:p>
     <w:p>
@@ -1371,7 +1371,7 @@
         <w:spacing w:after="120"/>
       </w:pPr>
       <w:r>
-        <w:t xml:space="preserve">channel_performance_summary is therefore built at channel + date grain, not person grain: for a given channel and day, it rolls up Wistia plays/engagement, Calendly bookings, and CRM leads created side by side. This answers the brief's request to “find relevance between marketing efforts, video visitor analysis, and new lead generation” as a correlation between channel-level trends, not as a traced individual customer journey. This mart was originally scoped as marketing_engagement_lead_correlation implying a joined journey; renamed here to avoid overstating what the join can support (Section 18, Item 3).</w:t>
+        <w:t xml:space="preserve">channel_performance_summary is therefore built at channel + date grain, not person grain: for a given channel and day, it rolls up Wistia plays/engagement, Calendly bookings, and CRM leads created side by side. This answers the brief's request to “find relevance between marketing efforts, video visitor analysis, and new lead generation” as a correlation between channel-level trends, not as a traced individual customer journey. This mart was originally scoped as marketing_engagement_lead_correlation implying a joined journey; renamed here to avoid overstating what the join can support (Section 19, Item 3).</w:t>
       </w:r>
     </w:p>
     <w:p>
@@ -1499,7 +1499,7 @@
         <w:spacing w:after="120"/>
       </w:pPr>
       <w:r>
-        <w:t xml:space="preserve">NULL channel handling: every real Calendly booking observed for a long stretch had channel=None (Section 18). Every mart that groups by channel uses COALESCE(channel, 'organic_unknown') so these bookings form a visible, countable bucket instead of silently vanishing from GROUP BY results — genuinely useful given what real traffic looks like, not just a null-safety nicety.</w:t>
+        <w:t xml:space="preserve">NULL channel handling: every real Calendly booking observed for a long stretch had channel=None (Section 19). Every mart that groups by channel uses COALESCE(channel, 'organic_unknown') so these bookings form a visible, countable bucket instead of silently vanishing from GROUP BY results — genuinely useful given what real traffic looks like, not just a null-safety nicety.</w:t>
       </w:r>
     </w:p>
     <w:p>
@@ -1571,7 +1571,7 @@
         <w:spacing w:after="120"/>
       </w:pPr>
       <w:r>
-        <w:t xml:space="preserve">Per Section 17's SME-confirmed decision, QuickSight (not Streamlit) reads the marts/ tables via Athena to render dashboards — one dataset per mart, direct-query mode (not SPICE) given the marts were still being actively iterated on during dashboard construction. QuickSight was already enabled on this AWS account (Enterprise-tier 30-day trial).</w:t>
+        <w:t xml:space="preserve">Per Section 18's SME-confirmed decision, QuickSight (not Streamlit) reads the marts/ tables via Athena to render dashboards — one dataset per mart, direct-query mode (not SPICE) given the marts were still being actively iterated on during dashboard construction. QuickSight was already enabled on this AWS account (Enterprise-tier 30-day trial).</w:t>
       </w:r>
     </w:p>
     <w:p>
@@ -1613,7 +1613,7 @@
         <w:spacing w:after="120"/>
       </w:pPr>
       <w:r>
-        <w:t xml:space="preserve">Once connected, one visual was built per mart (7 total): a stacked bar chart for daily_calls_booked_by_source, a combo chart (bars + line) for both bookings_trend_over_time and channel_performance_summary, a heat map for booking_volume_by_timeslot (with a calculated field forcing Monday–Sunday ordering, since QuickSight sorts text fields alphabetically by default and no built-in custom-sort option was available for this chart type), a horizontal bar chart for meeting_load_per_employee, and pie/donut charts for channel_attribution and cost_per_booking_by_channel given both currently show only a single real category (Section 18).</w:t>
+        <w:t xml:space="preserve">Once connected, one visual was built per mart (7 total): a stacked bar chart for daily_calls_booked_by_source, a combo chart (bars + line) for both bookings_trend_over_time and channel_performance_summary, a heat map for booking_volume_by_timeslot (with a calculated field forcing Monday–Sunday ordering, since QuickSight sorts text fields alphabetically by default and no built-in custom-sort option was available for this chart type), a horizontal bar chart for meeting_load_per_employee, and pie/donut charts for channel_attribution and cost_per_booking_by_channel — initially built when every real booking showed a single category (organic_unknown); now showing four real, distinct categories following the event_type-mapping fix in Section 15.</w:t>
       </w:r>
     </w:p>
     <w:p>
@@ -1622,7 +1622,94 @@
         <w:spacing w:after="150" w:before="300"/>
       </w:pPr>
       <w:r>
-        <w:t xml:space="preserve">15. Cost Considerations</w:t>
+        <w:t xml:space="preserve">15. Real-Data Findings &amp; Root-Cause Investigation (Aug 18, 2026)</w:t>
+      </w:r>
+    </w:p>
+    <w:p>
+      <w:pPr>
+        <w:spacing w:after="120"/>
+      </w:pPr>
+      <w:r>
+        <w:rPr>
+          <w:i/>
+          <w:iCs/>
+        </w:rPr>
+        <w:t xml:space="preserve">A single SME question — “CPB shows zero despite $100k+ in ad spend” — led to a focused investigation that surfaced two confirmed, fixed pipeline bugs and several genuine data/business findings worth recording here, not just in chat history.</w:t>
+      </w:r>
+    </w:p>
+    <w:p>
+      <w:pPr>
+        <w:spacing w:after="120"/>
+      </w:pPr>
+      <w:r>
+        <w:rPr>
+          <w:b/>
+          <w:bCs/>
+        </w:rPr>
+        <w:t xml:space="preserve">Finding 1 — the requirements doc's event_type channel mapping is stale for 2 of 3 channels: </w:t>
+      </w:r>
+      <w:r>
+        <w:t xml:space="preserve">The brief's own stated mechanism for channel attribution is scheduled_event.event_type (a fixed Calendly-assigned URL), NOT tracking.utm_campaign — this project's original build used utm_campaign, which turned out to be broken in practice (391 of 407 real bookings null; the remaining 16 contain visitor IP addresses, not channel names) AND was never the mechanism the brief specified. Switching to event_type, the doc's own three reference IDs were checked directly against real, current booking data: youtube_paid_ads matched correctly (6 real bookings); facebook_paid_ads matched only 1 historical booking with a generic name (almost certainly the doc's own original sample event); tiktok_paid_ads matched zero real bookings. Only 7 of 673 total real bookings (~1%) matched the doc's documented mapping at all. Real, currently-active event type IDs were identified directly from the data instead (three for Facebook, two for TikTok, cross-referenced against meeting names containing explicit “FB”/“TC” markers) and built into a new EVENT_TYPE_CHANNEL_MAP in glue_jobs/calendly_transform/script.py, replacing utm_campaign as the primary mechanism (the old logic is kept as a harmless fallback). Most likely explanation: Calendly assigns a new UUID whenever an event type is deleted and recreated, and the Facebook/TikTok booking pages were apparently rebuilt at some point after the doc was written, with nothing in the webhook payload indicating that drift. Shared with the SME directly, with the supporting query, for independent confirmation — this project proceeded on the self-derived mapping rather than waiting, per the same pattern used throughout (Section 18).</w:t>
+      </w:r>
+    </w:p>
+    <w:p>
+      <w:pPr>
+        <w:spacing w:after="120"/>
+      </w:pPr>
+      <w:r>
+        <w:rPr>
+          <w:b/>
+          <w:bCs/>
+        </w:rPr>
+        <w:t xml:space="preserve">Finding 2 — calendly_spend had up to 8x row duplication, inflating every spend-based metric: </w:t>
+      </w:r>
+      <w:r>
+        <w:t xml:space="preserve">Confirmed directly: GROUP BY (channel, date) on calendly_spend showed the same (channel, date) pair appearing 2–8 times, tapering from a peak of 8 near the middle of the observed date range down to 2 at the edges — the exact signature of overlapping data. Root cause: the requirements doc states each daily spend file “ranges for a time period of 30 days at maximum,” and the Glue transform job reads every raw spend file on every full-rebuild run without deduplicating — so a single (channel, date) fact, re-included in every overlapping daily pull that ever covered it, was counted once per file. This inflated bookings counts, spend totals, and CPB in every mart joining against calendly_spend (channel_attribution, cost_per_booking_by_channel): Facebook briefly showed 146 bookings and $437+ CPB before the fix, versus the correct 82 bookings once deduplicated. Fixed with drop_duplicates(subset=["channel","date"], keep="first") in transform_spend(), plus a safety check that logs a warning (rather than silently resolving) if any “duplicate” rows actually disagree on the spend value — which would indicate a real data revision, not harmless overlap. Verified post-fix: Facebook 82 bookings / $35,844 spend / $437.13 CPB, TikTok 17 / $4,020 / $236.50, YouTube 6 / $1,987 / $331.11 — all now matching direct booking counts exactly.</w:t>
+      </w:r>
+    </w:p>
+    <w:p>
+      <w:pPr>
+        <w:spacing w:after="120"/>
+      </w:pPr>
+      <w:r>
+        <w:rPr>
+          <w:b/>
+          <w:bCs/>
+        </w:rPr>
+        <w:t xml:space="preserve">Finding 3 — most Calendly bookings are not top-of-funnel at all: </w:t>
+      </w:r>
+      <w:r>
+        <w:t xml:space="preserve">A full distinct meeting_name query (91 unique values) showed the majority of real bookings are existing-student operational meetings — coaching check-ins, mock interviews, contract renewals, 1:1 onboarding calls — not new-lead intake. Since the webhook now writes every invitee.created event to raw/ regardless of type (Section 7), all of these flow into calendly_bookings alongside genuine top-of-funnel “Info Session”/“Breakthrough Session” bookings. This is expected given the raw-stays-unfiltered design principle, but worth noting explicitly: any per-channel metric is inherently diluted by a large population of bookings that were never going to carry channel attribution in the first place, since they aren't ad-driven bookings at all.</w:t>
+      </w:r>
+    </w:p>
+    <w:p>
+      <w:pPr>
+        <w:spacing w:after="120"/>
+      </w:pPr>
+      <w:r>
+        <w:rPr>
+          <w:b/>
+          <w:bCs/>
+        </w:rPr>
+        <w:t xml:space="preserve">Finding 4 — the CRM email/owner lookup gap is structural, not incidental: </w:t>
+      </w:r>
+      <w:r>
+        <w:t xml:space="preserve">Direct query confirmed 850 of 989 real CRM leads (86%) have no lead_email/lead_owner populated. Root cause, traced precisely: the dea-lead-owner lookup bucket is T-1 (SME-confirmed, Section 18), but the consumer Lambda only waits 10 minutes before its one and only lookup attempt — mathematically, 10 minutes can rarely bridge a ~24-hour data lag except by lucky timing. Compounding this, the idempotency check (processed/crm_leads_enriched/{lead_id}.parquet existence) means each lead is looked up exactly once, ever; if the owner file isn't ready at the 10-minute mark, it never gets retried even after the T-1 data catches up the next day. This matches the brief's own stated design (SME confirmed a missing owner is a valid outcome, not an error — Section 6), so it isn't classified as a bug requiring a fix, but it explains why most real leads show “pending” owner/email in both processed/ and the Slack notifications, and is worth stating plainly rather than leaving as an unexplained data gap.</w:t>
+      </w:r>
+    </w:p>
+    <w:p>
+      <w:pPr>
+        <w:spacing w:after="120"/>
+      </w:pPr>
+      <w:r>
+        <w:rPr>
+          <w:b/>
+          <w:bCs/>
+        </w:rPr>
+        <w:t xml:space="preserve">Finding 5 — Wistia's tracked videos are unlikely to be the actual paid-ad creative: </w:t>
+      </w:r>
+      <w:r>
+        <w:t xml:space="preserve">Investigated in response to the same CPB question, independent of the Calendly-side fixes above. Both tracked videos' real metadata shows 16- and 36-minute runtimes (far too long for a Facebook/YouTube/TikTok ad unit, which are typically under 2 minutes), sit in Wistia projects named “Testimonials” and “AE MW” (nurture-content framing, not ad-campaign framing), have zero tags, and generic unlocked share links — consistent with long-form content linked to after an ad click, not the ad itself. Real 2026 event volume (1–9 events/day, essentially flat all year with one single-day spike) does not resemble traffic driven by $100k+ in active spend. A partial, real signal was found independently in wistia_events.user_agent_details.browser — Meta's in-app browser is fingerprintable as “Facebook”/“Instagram”, and TikTok's as “TikTok” (confirmed present in real data, 11 events); YouTube has no equivalent fingerprint, since YouTube app links typically hand off to the device's default browser. This signal was not built into the pipeline — it only identifies platform, not paid-vs-organic origin within that platform, and there is still no shared ID connecting a specific Wistia viewing session to a specific Calendly booking or CRM lead (Section 10), so it can only ever inform aggregate, not person-level, correlation. Not yet raised with the SME as of this writing; the two tracked media IDs may not be the videos actually driving the ad spend the SME referenced.</w:t>
       </w:r>
     </w:p>
     <w:tbl>
@@ -2040,7 +2127,7 @@
                 <w:sz w:val="20"/>
                 <w:szCs w:val="20"/>
               </w:rPr>
-              <w:t xml:space="preserve">Confirmed acceptable by SME — see Section 17</w:t>
+              <w:t xml:space="preserve">Confirmed acceptable by SME — see Section 18</w:t>
             </w:r>
           </w:p>
         </w:tc>
@@ -2152,7 +2239,7 @@
         <w:spacing w:after="150" w:before="300"/>
       </w:pPr>
       <w:r>
-        <w:t xml:space="preserve">16. Alternatives Considered</w:t>
+        <w:t xml:space="preserve">17. Alternatives Considered</w:t>
       </w:r>
     </w:p>
     <w:tbl>
@@ -2304,7 +2391,7 @@
                 <w:sz w:val="20"/>
                 <w:szCs w:val="20"/>
               </w:rPr>
-              <w:t xml:space="preserve">Step Functions was proposed for its native sequencing, per-state retry, execution-name idempotency, and execution-history observability. SME direction was explicit and specific to this flow: use the SQS delay-queue pattern named in the brief; Step Functions/EventBridge Scheduler are unnecessary absent a specific reason. Implemented per that guidance — idempotency and DLQ handling are built in code instead of inherited from the platform (Section 6, Section 17)</w:t>
+              <w:t xml:space="preserve">Step Functions was proposed for its native sequencing, per-state retry, execution-name idempotency, and execution-history observability. SME direction was explicit and specific to this flow: use the SQS delay-queue pattern named in the brief; Step Functions/EventBridge Scheduler are unnecessary absent a specific reason. Implemented per that guidance — idempotency and DLQ handling are built in code instead of inherited from the platform (Section 6, Section 18)</w:t>
             </w:r>
           </w:p>
         </w:tc>
@@ -2370,7 +2457,7 @@
                 <w:sz w:val="20"/>
                 <w:szCs w:val="20"/>
               </w:rPr>
-              <w:t xml:space="preserve">SME confirmed both are acceptable (Section 17). Lakehouse pattern retained: matches both prior capstones and avoids provisioning a cluster for a 7-day, low-volume workload, given dbt and Snowflake are both prohibited</w:t>
+              <w:t xml:space="preserve">SME confirmed both are acceptable (Section 18). Lakehouse pattern retained: matches both prior capstones and avoids provisioning a cluster for a 7-day, low-volume workload, given dbt and Snowflake are both prohibited</w:t>
             </w:r>
           </w:p>
         </w:tc>
@@ -2436,7 +2523,7 @@
                 <w:sz w:val="20"/>
                 <w:szCs w:val="20"/>
               </w:rPr>
-              <w:t xml:space="preserve">SME confirmed QuickSight is acceptable and Streamlit hosting is not mandatory (Section 17); QuickSight also matches precedent from the prior two capstones</w:t>
+              <w:t xml:space="preserve">SME confirmed QuickSight is acceptable and Streamlit hosting is not mandatory (Section 18); QuickSight also matches precedent from the prior two capstones</w:t>
             </w:r>
           </w:p>
         </w:tc>
@@ -2502,7 +2589,7 @@
                 <w:sz w:val="20"/>
                 <w:szCs w:val="20"/>
               </w:rPr>
-              <w:t xml:space="preserve">SME confirmed either is acceptable (Section 17); Slack setup has no domain-verification/sandbox overhead</w:t>
+              <w:t xml:space="preserve">SME confirmed either is acceptable (Section 18); Slack setup has no domain-verification/sandbox overhead</w:t>
             </w:r>
           </w:p>
         </w:tc>
@@ -2580,7 +2667,7 @@
         <w:spacing w:after="150" w:before="300"/>
       </w:pPr>
       <w:r>
-        <w:t xml:space="preserve">17. Resolved via SME Response</w:t>
+        <w:t xml:space="preserve">18. Resolved via SME Response</w:t>
       </w:r>
     </w:p>
     <w:p>
@@ -2910,7 +2997,7 @@
                 <w:sz w:val="20"/>
                 <w:szCs w:val="20"/>
               </w:rPr>
-              <w:t xml:space="preserve">SQS delay queue implemented per Section 6; Step Functions moved to Section 16 as a documented, not-implemented alternative</w:t>
+              <w:t xml:space="preserve">SQS delay queue implemented per Section 6; Step Functions moved to Section 17 as a documented, not-implemented alternative</w:t>
             </w:r>
           </w:p>
         </w:tc>
@@ -3272,7 +3359,7 @@
         <w:spacing w:after="150" w:before="300"/>
       </w:pPr>
       <w:r>
-        <w:t xml:space="preserve">18. Open Items — Still Pending SME Confirmation</w:t>
+        <w:t xml:space="preserve">19. Open Items — Still Pending SME Confirmation</w:t>
       </w:r>
     </w:p>
     <w:p>
@@ -3349,7 +3436,7 @@
         <w:spacing w:after="80"/>
       </w:pPr>
       <w:r>
-        <w:t xml:space="preserve">5. Channel taxonomy alignment: the CRM lead's funnel custom field (e.g. “YT DE ACADEMY Direct VSL”) and Calendly's channel/event_type values (e.g. “youtube_paid_ads”) appear to represent the same underlying campaigns under different naming schemes. Assuming these are not directly joinable without a mapping table; channel_performance_summary correlates by date and coarse channel category (Facebook/YouTube/TikTok) rather than assuming an exact string match between the two fields.</w:t>
+        <w:t xml:space="preserve">5. Channel taxonomy alignment (partially resolved): channel attribution now works via event_type_id matching (Section 15, Finding 1), not the funnel-field guess this item originally described. The CRM lead's funnel custom field (e.g. “YT DE ACADEMY Direct VSL”) has still not been confirmed as joinable to Calendly's channel values — that specific gap remains open — but it's no longer the only or primary path to channel data the way it was when this item was first written.</w:t>
       </w:r>
     </w:p>
     <w:p>
@@ -3375,20 +3462,46 @@
         <w:spacing w:after="80"/>
       </w:pPr>
       <w:r>
-        <w:t xml:space="preserve">7. Calendly webhook signature (project decision, not SME confirmation): SME confirmed (Aug 12 follow-up) that the CRM/Close endpoint uses no signature at all, by design — resolved, see Section 17. The same wasn't separately confirmed for Calendly, but is now treated as resolved by project decision rather than left open: given the SME response pattern on this project and that Calendly's signing_key is genuinely optional at subscription creation (so “none was ever set” is plausible here too, not just “not yet sent”), REQUIRE_SIGNATURE_VALIDATION now defaults to “false” for Calendly as well. This is explicitly the project owner's judgment call, documented as such rather than attributed to the SME — reversible via the same flag if evidence emerges otherwise.</w:t>
-      </w:r>
-    </w:p>
-    <w:p>
-      <w:pPr>
-        <w:pStyle w:val="ListParagraph"/>
-        <w:numPr>
-          <w:ilvl w:val="0"/>
-          <w:numId w:val="1"/>
-        </w:numPr>
-        <w:spacing w:after="80"/>
-      </w:pPr>
-      <w:r>
-        <w:t xml:space="preserve">8. Calendly campaign_raw contains IP addresses, not channel identifiers, on a subset of real bookings: of ~407 real bookings, 391 have no tracking data at all (expected — organic/referred, no ad click). But the 16 that DO have a non-null tracking.utm_campaign value show what looks like the visitor's own IP address (e.g. “2600:4040:7b94:f600:98a8:6bbe:2cd5:6c6c”, “136.228.203.94”) rather than a channel name like facebook_paid_ads. Confirmed directly via an Athena GROUP BY on campaign_raw — this rules out a bug in this project's channel-matching logic (which correctly checks the right field and correctly finds no match for these values) and points instead at the paid-ad campaign's own booking-link/UTM template using the wrong token upstream, on the ad platform or landing-page side, not something this pipeline can infer or correct. Raised with the SME (Aug 2026); awaiting response on whether the campaign link configuration can be corrected, or whether a different field should be read instead.</w:t>
+        <w:t xml:space="preserve">7. Calendly webhook signature (project decision, not SME confirmation): SME confirmed (Aug 12 follow-up) that the CRM/Close endpoint uses no signature at all, by design — resolved, see Section 18. The same wasn't separately confirmed for Calendly, but is now treated as resolved by project decision rather than left open: given the SME response pattern on this project and that Calendly's signing_key is genuinely optional at subscription creation (so “none was ever set” is plausible here too, not just “not yet sent”), REQUIRE_SIGNATURE_VALIDATION now defaults to “false” for Calendly as well. This is explicitly the project owner's judgment call, documented as such rather than attributed to the SME — reversible via the same flag if evidence emerges otherwise.</w:t>
+      </w:r>
+    </w:p>
+    <w:p>
+      <w:pPr>
+        <w:pStyle w:val="ListParagraph"/>
+        <w:numPr>
+          <w:ilvl w:val="0"/>
+          <w:numId w:val="1"/>
+        </w:numPr>
+        <w:spacing w:after="80"/>
+      </w:pPr>
+      <w:r>
+        <w:t xml:space="preserve">8. Calendly campaign_raw contains IP addresses, not channel identifiers, on a subset of real bookings (superseded by Section 15, Finding 1): of ~407 real bookings at the time this was first found, 391 had no tracking data at all; the remaining 16 showed what looked like visitor IP addresses in tracking.utm_campaign rather than a channel name. This finding stands as-is (still true, and still worth the SME's awareness), but it's no longer a blocker: the pipeline switched to event_type_id as the primary channel-matching mechanism, which doesn't depend on tracking.utm_campaign at all. Raised with the SME alongside the event_type staleness finding.</w:t>
+      </w:r>
+    </w:p>
+    <w:p>
+      <w:pPr>
+        <w:pStyle w:val="ListParagraph"/>
+        <w:numPr>
+          <w:ilvl w:val="0"/>
+          <w:numId w:val="1"/>
+        </w:numPr>
+        <w:spacing w:after="80"/>
+      </w:pPr>
+      <w:r>
+        <w:t xml:space="preserve">9. Wistia's two tracked videos may not be the actual ad creative (Section 15, Finding 5): both are long-form nurture content (16 and 36 minutes), sit in “Testimonials”/“AE MW” Wistia projects, and show 2026 traffic volume (1–9 events/day) that doesn't resemble $100k+ in active ad spend. Not yet raised with the SME — worth confirming whether these are genuinely the right two videos to be tracking for ad-channel correlation, independent of the Calendly-side fixes.</w:t>
+      </w:r>
+    </w:p>
+    <w:p>
+      <w:pPr>
+        <w:pStyle w:val="ListParagraph"/>
+        <w:numPr>
+          <w:ilvl w:val="0"/>
+          <w:numId w:val="1"/>
+        </w:numPr>
+        <w:spacing w:after="80"/>
+      </w:pPr>
+      <w:r>
+        <w:t xml:space="preserve">10. CRM email/owner lookup gap is structural (Section 15, Finding 4): 86% of real leads (850/989) have no lead_email/lead_owner, because the 10-minute wait can rarely bridge the T-1 lookup-bucket lag, and each lead is only ever looked up once (idempotency prevents retry even after the data catches up). Matches the SME-confirmed design (Section 6), so not treated as a bug — documented here so the resulting data gap isn't mistaken for an unexplained defect.</w:t>
       </w:r>
     </w:p>
     <w:p>
@@ -3397,59 +3510,98 @@
         <w:spacing w:after="150" w:before="300"/>
       </w:pPr>
       <w:r>
-        <w:t xml:space="preserve">19. Next Steps</w:t>
-      </w:r>
-    </w:p>
-    <w:p>
-      <w:pPr>
-        <w:pStyle w:val="ListParagraph"/>
-        <w:numPr>
-          <w:ilvl w:val="0"/>
-          <w:numId w:val="1"/>
-        </w:numPr>
-        <w:spacing w:after="80"/>
-      </w:pPr>
-      <w:r>
-        <w:t xml:space="preserve">All four pipeline layers — ingestion (CRM, Calendly, Wistia), Glue transform, Glue Data Catalog, and Athena marts — are built, deployed, and verified against real production data as of this writing. QuickSight dashboard built with one visual per mart (Section 14).</w:t>
-      </w:r>
-    </w:p>
-    <w:p>
-      <w:pPr>
-        <w:pStyle w:val="ListParagraph"/>
-        <w:numPr>
-          <w:ilvl w:val="0"/>
-          <w:numId w:val="1"/>
-        </w:numPr>
-        <w:spacing w:after="80"/>
-      </w:pPr>
-      <w:r>
-        <w:t xml:space="preserve">Awaiting SME response on Item 8 (Section 18) — the campaign_raw/IP-address finding — before treating channel-level marketing metrics as trustworthy for reporting; the pipeline itself handles the current data correctly (COALESCE to organic_unknown), this is a data-source question, not a pipeline gap.</w:t>
-      </w:r>
-    </w:p>
-    <w:p>
-      <w:pPr>
-        <w:pStyle w:val="ListParagraph"/>
-        <w:numPr>
-          <w:ilvl w:val="0"/>
-          <w:numId w:val="1"/>
-        </w:numPr>
-        <w:spacing w:after="80"/>
-      </w:pPr>
-      <w:r>
-        <w:t xml:space="preserve">Consider whether Wistia's processed/ tables (media metadata, engagement, events) warrant their own marts — currently ingested and transformed but not yet surfaced in Athena marts or QuickSight, since the original Section 9/10 scope was Calendly-metrics-plus-cross-source-correlation, not a dedicated Wistia analytics layer.</w:t>
-      </w:r>
-    </w:p>
-    <w:p>
-      <w:pPr>
-        <w:pStyle w:val="ListParagraph"/>
-        <w:numPr>
-          <w:ilvl w:val="0"/>
-          <w:numId w:val="1"/>
-        </w:numPr>
-        <w:spacing w:after="80"/>
-      </w:pPr>
-      <w:r>
-        <w:t xml:space="preserve">Re-enable REQUIRE_SIGNATURE_VALIDATION for Calendly (Item 7, Section 18) if the SME confirms a signing_key was in fact set on that subscription.</w:t>
+        <w:t xml:space="preserve">20. Next Steps</w:t>
+      </w:r>
+    </w:p>
+    <w:p>
+      <w:pPr>
+        <w:pStyle w:val="ListParagraph"/>
+        <w:numPr>
+          <w:ilvl w:val="0"/>
+          <w:numId w:val="1"/>
+        </w:numPr>
+        <w:spacing w:after="80"/>
+      </w:pPr>
+      <w:r>
+        <w:t xml:space="preserve">All four pipeline layers — ingestion (CRM, Calendly, Wistia), Glue transform, Glue Data Catalog, and Athena marts — are built, deployed, and verified against real production data as of this writing. QuickSight dashboard built with one visual per mart (Section 14), now reflecting real, corrected channel and spend data following Section 15's fixes.</w:t>
+      </w:r>
+    </w:p>
+    <w:p>
+      <w:pPr>
+        <w:pStyle w:val="ListParagraph"/>
+        <w:numPr>
+          <w:ilvl w:val="0"/>
+          <w:numId w:val="1"/>
+        </w:numPr>
+        <w:spacing w:after="80"/>
+      </w:pPr>
+      <w:r>
+        <w:t xml:space="preserve">Both Section 15 fixes (event_type channel mapping, calendly_spend deduplication) are deployed and independently verified against direct Athena queries, not just “the job succeeded” — real counts cross-checked between calendly_bookings and channel_attribution, matching exactly post-fix.</w:t>
+      </w:r>
+    </w:p>
+    <w:p>
+      <w:pPr>
+        <w:pStyle w:val="ListParagraph"/>
+        <w:numPr>
+          <w:ilvl w:val="0"/>
+          <w:numId w:val="1"/>
+        </w:numPr>
+        <w:spacing w:after="80"/>
+      </w:pPr>
+      <w:r>
+        <w:t xml:space="preserve">Awaiting SME response on the event_type mapping finding (Section 15, Finding 1; Section 18) — self-derived mapping is deployed and treated as correct in the meantime, per the same proceed-without-blocking pattern used throughout this project; open to correction if the SME's confirmation differs.</w:t>
+      </w:r>
+    </w:p>
+    <w:p>
+      <w:pPr>
+        <w:pStyle w:val="ListParagraph"/>
+        <w:numPr>
+          <w:ilvl w:val="0"/>
+          <w:numId w:val="1"/>
+        </w:numPr>
+        <w:spacing w:after="80"/>
+      </w:pPr>
+      <w:r>
+        <w:t xml:space="preserve">7 rows of the original event_type/meeting_name distinct-values query were never fully reviewed (a display truncation, not a data gap) — worth a follow-up pass to confirm no additional Facebook/YouTube/TikTok event type was missed in EVENT_TYPE_CHANNEL_MAP.</w:t>
+      </w:r>
+    </w:p>
+    <w:p>
+      <w:pPr>
+        <w:pStyle w:val="ListParagraph"/>
+        <w:numPr>
+          <w:ilvl w:val="0"/>
+          <w:numId w:val="1"/>
+        </w:numPr>
+        <w:spacing w:after="80"/>
+      </w:pPr>
+      <w:r>
+        <w:t xml:space="preserve">Wistia's likely-mismatched tracked videos (Section 15, Finding 5) not yet raised with the SME — worth confirming whether the two currently-tracked media IDs are actually the right ones for ad-channel correlation before investing further in a Wistia-inclusive mart.</w:t>
+      </w:r>
+    </w:p>
+    <w:p>
+      <w:pPr>
+        <w:pStyle w:val="ListParagraph"/>
+        <w:numPr>
+          <w:ilvl w:val="0"/>
+          <w:numId w:val="1"/>
+        </w:numPr>
+        <w:spacing w:after="80"/>
+      </w:pPr>
+      <w:r>
+        <w:t xml:space="preserve">Consider whether Wistia's processed/ tables (media metadata, engagement, events) warrant their own marts — currently ingested and transformed but not yet surfaced in Athena marts or QuickSight, since the original Section 9/10 scope was Calendly-metrics-plus-cross-source-correlation, not a dedicated Wistia analytics layer. Lower priority given Finding 5 — worth resolving which videos to track before building a mart around the wrong ones.</w:t>
+      </w:r>
+    </w:p>
+    <w:p>
+      <w:pPr>
+        <w:pStyle w:val="ListParagraph"/>
+        <w:numPr>
+          <w:ilvl w:val="0"/>
+          <w:numId w:val="1"/>
+        </w:numPr>
+        <w:spacing w:after="80"/>
+      </w:pPr>
+      <w:r>
+        <w:t xml:space="preserve">Re-enable REQUIRE_SIGNATURE_VALIDATION for Calendly (Item 7, Section 19) if the SME confirms a signing_key was in fact set on that subscription.</w:t>
       </w:r>
     </w:p>
     <w:p>
@@ -3489,6 +3641,19 @@
       </w:pPr>
       <w:r>
         <w:t xml:space="preserve">Clean up the synthetic test lead (lead_test123) from processed/crm_leads_enriched/ before treating marts output as production-clean, if not already done.</w:t>
+      </w:r>
+    </w:p>
+    <w:p>
+      <w:pPr>
+        <w:pStyle w:val="ListParagraph"/>
+        <w:numPr>
+          <w:ilvl w:val="0"/>
+          <w:numId w:val="1"/>
+        </w:numPr>
+        <w:spacing w:after="80"/>
+      </w:pPr>
+      <w:r>
+        <w:t xml:space="preserve">Confirm the 7-consecutive-day operational window (Item 1, Section 19) is counted from a point AFTER Section 15's fixes landed, not from earlier runs that were producing incorrect channel/spend data — a system running without crashing but reporting wrong numbers is a weaker claim of “reliable operation” than one demonstrably correct throughout the window.</w:t>
       </w:r>
     </w:p>
     <w:sectPr>

</xml_diff>